<commit_message>
Testing smooth_non_aut with combination of polynomial and custom/Fourier libraries; no success yet.  Updated results table accordingly.
</commit_message>
<xml_diff>
--- a/SINDy ID Results Table.docx
+++ b/SINDy ID Results Table.docx
@@ -9,13 +9,13 @@
         <w:tblLook w:val="04A0" w:firstRow="1" w:lastRow="0" w:firstColumn="1" w:lastColumn="0" w:noHBand="0" w:noVBand="1"/>
       </w:tblPr>
       <w:tblGrid>
-        <w:gridCol w:w="1141"/>
+        <w:gridCol w:w="1087"/>
         <w:gridCol w:w="1450"/>
-        <w:gridCol w:w="1337"/>
-        <w:gridCol w:w="1195"/>
-        <w:gridCol w:w="1337"/>
-        <w:gridCol w:w="1359"/>
-        <w:gridCol w:w="1716"/>
+        <w:gridCol w:w="1461"/>
+        <w:gridCol w:w="1186"/>
+        <w:gridCol w:w="1327"/>
+        <w:gridCol w:w="1349"/>
+        <w:gridCol w:w="1675"/>
       </w:tblGrid>
       <w:tr>
         <w:tc>
@@ -170,9 +170,16 @@
                 <w:sz w:val="20"/>
                 <w:szCs w:val="20"/>
               </w:rPr>
-              <w:t>Threshold Sensitivity</w:t>
-            </w:r>
-            <w:r>
+              <w:t>Threshold Sensitivity (If Applicable)</w:t>
+            </w:r>
+          </w:p>
+        </w:tc>
+        <w:tc>
+          <w:tcPr>
+            <w:tcW w:w="1716" w:type="dxa"/>
+          </w:tcPr>
+          <w:p>
+            <w:pPr>
               <w:rPr>
                 <w:rFonts w:ascii="Helvetica" w:hAnsi="Helvetica" w:cs="Helvetica"/>
                 <w:b/>
@@ -180,16 +187,8 @@
                 <w:sz w:val="20"/>
                 <w:szCs w:val="20"/>
               </w:rPr>
-              <w:t xml:space="preserve"> (If Applicable)</w:t>
-            </w:r>
-          </w:p>
-        </w:tc>
-        <w:tc>
-          <w:tcPr>
-            <w:tcW w:w="1716" w:type="dxa"/>
-          </w:tcPr>
-          <w:p>
-            <w:pPr>
+            </w:pPr>
+            <w:r>
               <w:rPr>
                 <w:rFonts w:ascii="Helvetica" w:hAnsi="Helvetica" w:cs="Helvetica"/>
                 <w:b/>
@@ -197,7 +196,8 @@
                 <w:sz w:val="20"/>
                 <w:szCs w:val="20"/>
               </w:rPr>
-            </w:pPr>
+              <w:t>Optimal</w:t>
+            </w:r>
             <w:r>
               <w:rPr>
                 <w:rFonts w:ascii="Helvetica" w:hAnsi="Helvetica" w:cs="Helvetica"/>
@@ -206,7 +206,7 @@
                 <w:sz w:val="20"/>
                 <w:szCs w:val="20"/>
               </w:rPr>
-              <w:t>Optimal</w:t>
+              <w:t xml:space="preserve"> </w:t>
             </w:r>
             <w:r>
               <w:rPr>
@@ -216,7 +216,7 @@
                 <w:sz w:val="20"/>
                 <w:szCs w:val="20"/>
               </w:rPr>
-              <w:t xml:space="preserve"> </w:t>
+              <w:t>Parameter(s)</w:t>
             </w:r>
             <w:r>
               <w:rPr>
@@ -226,27 +226,7 @@
                 <w:sz w:val="20"/>
                 <w:szCs w:val="20"/>
               </w:rPr>
-              <w:t>Parameter(s)</w:t>
-            </w:r>
-            <w:r>
-              <w:rPr>
-                <w:rFonts w:ascii="Helvetica" w:hAnsi="Helvetica" w:cs="Helvetica"/>
-                <w:b/>
-                <w:bCs/>
-                <w:sz w:val="20"/>
-                <w:szCs w:val="20"/>
-              </w:rPr>
-              <w:t xml:space="preserve"> </w:t>
-            </w:r>
-            <w:r>
-              <w:rPr>
-                <w:rFonts w:ascii="Helvetica" w:hAnsi="Helvetica" w:cs="Helvetica"/>
-                <w:b/>
-                <w:bCs/>
-                <w:sz w:val="20"/>
-                <w:szCs w:val="20"/>
-              </w:rPr>
-              <w:t>(If Applicable)</w:t>
+              <w:t xml:space="preserve"> (If Applicable)</w:t>
             </w:r>
           </w:p>
         </w:tc>
@@ -1477,15 +1457,7 @@
                 <w:sz w:val="20"/>
                 <w:szCs w:val="20"/>
               </w:rPr>
-              <w:t>VF-FHN-</w:t>
-            </w:r>
-            <w:r>
-              <w:rPr>
-                <w:rFonts w:ascii="Helvetica" w:hAnsi="Helvetica" w:cs="Helvetica"/>
-                <w:sz w:val="20"/>
-                <w:szCs w:val="20"/>
-              </w:rPr>
-              <w:t>b</w:t>
+              <w:t>VF-FHN-b</w:t>
             </w:r>
           </w:p>
         </w:tc>
@@ -1663,6 +1635,24 @@
               </w:rPr>
               <w:t>Degree-3 polynomials</w:t>
             </w:r>
+            <w:r>
+              <w:rPr>
+                <w:rFonts w:ascii="Helvetica" w:hAnsi="Helvetica" w:cs="Helvetica"/>
+                <w:sz w:val="20"/>
+                <w:szCs w:val="20"/>
+              </w:rPr>
+              <w:t xml:space="preserve"> + </w:t>
+            </w:r>
+            <w:proofErr w:type="spellStart"/>
+            <w:r>
+              <w:rPr>
+                <w:rFonts w:ascii="Helvetica" w:hAnsi="Helvetica" w:cs="Helvetica"/>
+                <w:sz w:val="20"/>
+                <w:szCs w:val="20"/>
+              </w:rPr>
+              <w:t>FourierLibrary</w:t>
+            </w:r>
+            <w:proofErr w:type="spellEnd"/>
           </w:p>
         </w:tc>
         <w:tc>
@@ -1705,25 +1695,7 @@
                 <w:sz w:val="20"/>
                 <w:szCs w:val="20"/>
               </w:rPr>
-              <w:t xml:space="preserve">No (u’ 6 </w:t>
-            </w:r>
-            <w:proofErr w:type="gramStart"/>
-            <w:r>
-              <w:rPr>
-                <w:rFonts w:ascii="Helvetica" w:hAnsi="Helvetica" w:cs="Helvetica"/>
-                <w:sz w:val="20"/>
-                <w:szCs w:val="20"/>
-              </w:rPr>
-              <w:t>extra</w:t>
-            </w:r>
-            <w:proofErr w:type="gramEnd"/>
-            <w:r>
-              <w:rPr>
-                <w:rFonts w:ascii="Helvetica" w:hAnsi="Helvetica" w:cs="Helvetica"/>
-                <w:sz w:val="20"/>
-                <w:szCs w:val="20"/>
-              </w:rPr>
-              <w:t>, v’ 0 extra)</w:t>
+              <w:t>In-progress</w:t>
             </w:r>
           </w:p>
         </w:tc>
@@ -1739,6 +1711,14 @@
                 <w:szCs w:val="20"/>
               </w:rPr>
             </w:pPr>
+            <w:r>
+              <w:rPr>
+                <w:rFonts w:ascii="Helvetica" w:hAnsi="Helvetica" w:cs="Helvetica"/>
+                <w:sz w:val="20"/>
+                <w:szCs w:val="20"/>
+              </w:rPr>
+              <w:t>In-progress</w:t>
+            </w:r>
           </w:p>
         </w:tc>
         <w:tc>
@@ -1753,6 +1733,38 @@
                 <w:szCs w:val="20"/>
               </w:rPr>
             </w:pPr>
+            <w:r>
+              <w:rPr>
+                <w:rFonts w:ascii="Helvetica" w:hAnsi="Helvetica" w:cs="Helvetica"/>
+                <w:sz w:val="20"/>
+                <w:szCs w:val="20"/>
+              </w:rPr>
+              <w:t>In-progress</w:t>
+            </w:r>
+            <w:r>
+              <w:rPr>
+                <w:rFonts w:ascii="Helvetica" w:hAnsi="Helvetica" w:cs="Helvetica"/>
+                <w:sz w:val="20"/>
+                <w:szCs w:val="20"/>
+              </w:rPr>
+              <w:t xml:space="preserve"> (</w:t>
+            </w:r>
+            <w:r>
+              <w:rPr>
+                <w:rFonts w:ascii="Helvetica" w:hAnsi="Helvetica" w:cs="Helvetica"/>
+                <w:sz w:val="20"/>
+                <w:szCs w:val="20"/>
+              </w:rPr>
+              <w:t>α=0.</w:t>
+            </w:r>
+            <w:r>
+              <w:rPr>
+                <w:rFonts w:ascii="Helvetica" w:hAnsi="Helvetica" w:cs="Helvetica"/>
+                <w:sz w:val="20"/>
+                <w:szCs w:val="20"/>
+              </w:rPr>
+              <w:t>00001 currently yielding fewest spurious terms)</w:t>
+            </w:r>
           </w:p>
         </w:tc>
       </w:tr>
@@ -1833,32 +1845,6 @@
                 <w:szCs w:val="20"/>
               </w:rPr>
             </w:pPr>
-            <w:r>
-              <w:rPr>
-                <w:rFonts w:ascii="Helvetica" w:hAnsi="Helvetica" w:cs="Helvetica"/>
-                <w:sz w:val="20"/>
-                <w:szCs w:val="20"/>
-              </w:rPr>
-              <w:t xml:space="preserve">No (u’ 6 </w:t>
-            </w:r>
-            <w:proofErr w:type="gramStart"/>
-            <w:r>
-              <w:rPr>
-                <w:rFonts w:ascii="Helvetica" w:hAnsi="Helvetica" w:cs="Helvetica"/>
-                <w:sz w:val="20"/>
-                <w:szCs w:val="20"/>
-              </w:rPr>
-              <w:t>extra</w:t>
-            </w:r>
-            <w:proofErr w:type="gramEnd"/>
-            <w:r>
-              <w:rPr>
-                <w:rFonts w:ascii="Helvetica" w:hAnsi="Helvetica" w:cs="Helvetica"/>
-                <w:sz w:val="20"/>
-                <w:szCs w:val="20"/>
-              </w:rPr>
-              <w:t>, v’ 0 extra)</w:t>
-            </w:r>
           </w:p>
         </w:tc>
         <w:tc>
@@ -1909,15 +1895,7 @@
                 <w:sz w:val="20"/>
                 <w:szCs w:val="20"/>
               </w:rPr>
-              <w:t>VF-FHN-</w:t>
-            </w:r>
-            <w:r>
-              <w:rPr>
-                <w:rFonts w:ascii="Helvetica" w:hAnsi="Helvetica" w:cs="Helvetica"/>
-                <w:sz w:val="20"/>
-                <w:szCs w:val="20"/>
-              </w:rPr>
-              <w:t>a</w:t>
+              <w:t>VF-FHN-a</w:t>
             </w:r>
           </w:p>
         </w:tc>
@@ -1975,32 +1953,6 @@
                 <w:szCs w:val="20"/>
               </w:rPr>
             </w:pPr>
-            <w:r>
-              <w:rPr>
-                <w:rFonts w:ascii="Helvetica" w:hAnsi="Helvetica" w:cs="Helvetica"/>
-                <w:sz w:val="20"/>
-                <w:szCs w:val="20"/>
-              </w:rPr>
-              <w:t xml:space="preserve">No (u’ 6 </w:t>
-            </w:r>
-            <w:proofErr w:type="gramStart"/>
-            <w:r>
-              <w:rPr>
-                <w:rFonts w:ascii="Helvetica" w:hAnsi="Helvetica" w:cs="Helvetica"/>
-                <w:sz w:val="20"/>
-                <w:szCs w:val="20"/>
-              </w:rPr>
-              <w:t>extra</w:t>
-            </w:r>
-            <w:proofErr w:type="gramEnd"/>
-            <w:r>
-              <w:rPr>
-                <w:rFonts w:ascii="Helvetica" w:hAnsi="Helvetica" w:cs="Helvetica"/>
-                <w:sz w:val="20"/>
-                <w:szCs w:val="20"/>
-              </w:rPr>
-              <w:t>, v’ 0 extra)</w:t>
-            </w:r>
           </w:p>
         </w:tc>
         <w:tc>
@@ -2051,15 +2003,7 @@
                 <w:sz w:val="20"/>
                 <w:szCs w:val="20"/>
               </w:rPr>
-              <w:t>VF-FHN-</w:t>
-            </w:r>
-            <w:r>
-              <w:rPr>
-                <w:rFonts w:ascii="Helvetica" w:hAnsi="Helvetica" w:cs="Helvetica"/>
-                <w:sz w:val="20"/>
-                <w:szCs w:val="20"/>
-              </w:rPr>
-              <w:t>b</w:t>
+              <w:t>VF-FHN-b</w:t>
             </w:r>
           </w:p>
         </w:tc>
@@ -2117,32 +2061,6 @@
                 <w:szCs w:val="20"/>
               </w:rPr>
             </w:pPr>
-            <w:r>
-              <w:rPr>
-                <w:rFonts w:ascii="Helvetica" w:hAnsi="Helvetica" w:cs="Helvetica"/>
-                <w:sz w:val="20"/>
-                <w:szCs w:val="20"/>
-              </w:rPr>
-              <w:t xml:space="preserve">No (u’ 6 </w:t>
-            </w:r>
-            <w:proofErr w:type="gramStart"/>
-            <w:r>
-              <w:rPr>
-                <w:rFonts w:ascii="Helvetica" w:hAnsi="Helvetica" w:cs="Helvetica"/>
-                <w:sz w:val="20"/>
-                <w:szCs w:val="20"/>
-              </w:rPr>
-              <w:t>extra</w:t>
-            </w:r>
-            <w:proofErr w:type="gramEnd"/>
-            <w:r>
-              <w:rPr>
-                <w:rFonts w:ascii="Helvetica" w:hAnsi="Helvetica" w:cs="Helvetica"/>
-                <w:sz w:val="20"/>
-                <w:szCs w:val="20"/>
-              </w:rPr>
-              <w:t>, v’ 0 extra)</w:t>
-            </w:r>
           </w:p>
         </w:tc>
         <w:tc>
@@ -2797,6 +2715,7 @@
   <w:style w:type="character" w:default="1" w:styleId="DefaultParagraphFont">
     <w:name w:val="Default Paragraph Font"/>
     <w:uiPriority w:val="1"/>
+    <w:semiHidden/>
     <w:unhideWhenUsed/>
   </w:style>
   <w:style w:type="table" w:default="1" w:styleId="TableNormal">

</xml_diff>

<commit_message>
Made table more compact for now to improve text size in abstract.
</commit_message>
<xml_diff>
--- a/SINDy ID Results Table.docx
+++ b/SINDy ID Results Table.docx
@@ -5,22 +5,29 @@
     <w:tbl>
       <w:tblPr>
         <w:tblStyle w:val="TableGrid"/>
-        <w:tblW w:w="9535" w:type="dxa"/>
+        <w:tblW w:w="0" w:type="auto"/>
+        <w:jc w:val="center"/>
+        <w:tblCellMar>
+          <w:top w:w="58" w:type="dxa"/>
+          <w:bottom w:w="58" w:type="dxa"/>
+        </w:tblCellMar>
         <w:tblLook w:val="04A0" w:firstRow="1" w:lastRow="0" w:firstColumn="1" w:lastColumn="0" w:noHBand="0" w:noVBand="1"/>
       </w:tblPr>
       <w:tblGrid>
-        <w:gridCol w:w="1162"/>
-        <w:gridCol w:w="1450"/>
-        <w:gridCol w:w="1461"/>
-        <w:gridCol w:w="1177"/>
-        <w:gridCol w:w="1316"/>
-        <w:gridCol w:w="1338"/>
-        <w:gridCol w:w="1631"/>
+        <w:gridCol w:w="1128"/>
+        <w:gridCol w:w="1673"/>
+        <w:gridCol w:w="1139"/>
+        <w:gridCol w:w="1528"/>
+        <w:gridCol w:w="1547"/>
       </w:tblGrid>
       <w:tr>
-        <w:tc>
-          <w:tcPr>
-            <w:tcW w:w="1255" w:type="dxa"/>
+        <w:trPr>
+          <w:trHeight w:val="465"/>
+          <w:jc w:val="center"/>
+        </w:trPr>
+        <w:tc>
+          <w:tcPr>
+            <w:tcW w:w="0" w:type="auto"/>
           </w:tcPr>
           <w:p>
             <w:pPr>
@@ -46,7 +53,7 @@
         </w:tc>
         <w:tc>
           <w:tcPr>
-            <w:tcW w:w="1282" w:type="dxa"/>
+            <w:tcW w:w="0" w:type="auto"/>
           </w:tcPr>
           <w:p>
             <w:pPr>
@@ -66,13 +73,13 @@
                 <w:sz w:val="20"/>
                 <w:szCs w:val="20"/>
               </w:rPr>
-              <w:t>Non-Autonomous Terms</w:t>
-            </w:r>
-          </w:p>
-        </w:tc>
-        <w:tc>
-          <w:tcPr>
-            <w:tcW w:w="1461" w:type="dxa"/>
+              <w:t>Feature Library</w:t>
+            </w:r>
+          </w:p>
+        </w:tc>
+        <w:tc>
+          <w:tcPr>
+            <w:tcW w:w="0" w:type="auto"/>
           </w:tcPr>
           <w:p>
             <w:pPr>
@@ -92,13 +99,13 @@
                 <w:sz w:val="20"/>
                 <w:szCs w:val="20"/>
               </w:rPr>
-              <w:t>Feature Library</w:t>
-            </w:r>
-          </w:p>
-        </w:tc>
-        <w:tc>
-          <w:tcPr>
-            <w:tcW w:w="1186" w:type="dxa"/>
+              <w:t>Optimizer</w:t>
+            </w:r>
+          </w:p>
+        </w:tc>
+        <w:tc>
+          <w:tcPr>
+            <w:tcW w:w="0" w:type="auto"/>
           </w:tcPr>
           <w:p>
             <w:pPr>
@@ -118,13 +125,13 @@
                 <w:sz w:val="20"/>
                 <w:szCs w:val="20"/>
               </w:rPr>
-              <w:t>Optimizer</w:t>
-            </w:r>
-          </w:p>
-        </w:tc>
-        <w:tc>
-          <w:tcPr>
-            <w:tcW w:w="1327" w:type="dxa"/>
+              <w:t>Successful ID</w:t>
+            </w:r>
+          </w:p>
+        </w:tc>
+        <w:tc>
+          <w:tcPr>
+            <w:tcW w:w="1547" w:type="dxa"/>
           </w:tcPr>
           <w:p>
             <w:pPr>
@@ -144,16 +151,9 @@
                 <w:sz w:val="20"/>
                 <w:szCs w:val="20"/>
               </w:rPr>
-              <w:t>Successful ID</w:t>
-            </w:r>
-          </w:p>
-        </w:tc>
-        <w:tc>
-          <w:tcPr>
-            <w:tcW w:w="1349" w:type="dxa"/>
-          </w:tcPr>
-          <w:p>
-            <w:pPr>
+              <w:t>Threshold Sensitivity</w:t>
+            </w:r>
+            <w:r>
               <w:rPr>
                 <w:rFonts w:ascii="Helvetica" w:hAnsi="Helvetica" w:cs="Helvetica"/>
                 <w:b/>
@@ -161,7 +161,8 @@
                 <w:sz w:val="20"/>
                 <w:szCs w:val="20"/>
               </w:rPr>
-            </w:pPr>
+              <w:t xml:space="preserve"> </w:t>
+            </w:r>
             <w:r>
               <w:rPr>
                 <w:rFonts w:ascii="Helvetica" w:hAnsi="Helvetica" w:cs="Helvetica"/>
@@ -170,71 +171,19 @@
                 <w:sz w:val="20"/>
                 <w:szCs w:val="20"/>
               </w:rPr>
-              <w:t>Threshold Sensitivity (If Applicable)</w:t>
-            </w:r>
-          </w:p>
-        </w:tc>
-        <w:tc>
-          <w:tcPr>
-            <w:tcW w:w="1675" w:type="dxa"/>
-          </w:tcPr>
-          <w:p>
-            <w:pPr>
-              <w:rPr>
-                <w:rFonts w:ascii="Helvetica" w:hAnsi="Helvetica" w:cs="Helvetica"/>
-                <w:b/>
-                <w:bCs/>
-                <w:sz w:val="20"/>
-                <w:szCs w:val="20"/>
-              </w:rPr>
-            </w:pPr>
-            <w:r>
-              <w:rPr>
-                <w:rFonts w:ascii="Helvetica" w:hAnsi="Helvetica" w:cs="Helvetica"/>
-                <w:b/>
-                <w:bCs/>
-                <w:sz w:val="20"/>
-                <w:szCs w:val="20"/>
-              </w:rPr>
-              <w:t>Optimal</w:t>
-            </w:r>
-            <w:r>
-              <w:rPr>
-                <w:rFonts w:ascii="Helvetica" w:hAnsi="Helvetica" w:cs="Helvetica"/>
-                <w:b/>
-                <w:bCs/>
-                <w:sz w:val="20"/>
-                <w:szCs w:val="20"/>
-              </w:rPr>
-              <w:t xml:space="preserve"> </w:t>
-            </w:r>
-            <w:r>
-              <w:rPr>
-                <w:rFonts w:ascii="Helvetica" w:hAnsi="Helvetica" w:cs="Helvetica"/>
-                <w:b/>
-                <w:bCs/>
-                <w:sz w:val="20"/>
-                <w:szCs w:val="20"/>
-              </w:rPr>
-              <w:t>Parameter(s)</w:t>
-            </w:r>
-            <w:r>
-              <w:rPr>
-                <w:rFonts w:ascii="Helvetica" w:hAnsi="Helvetica" w:cs="Helvetica"/>
-                <w:b/>
-                <w:bCs/>
-                <w:sz w:val="20"/>
-                <w:szCs w:val="20"/>
-              </w:rPr>
-              <w:t xml:space="preserve"> (If Applicable)</w:t>
+              <w:t>(If Applicable)</w:t>
             </w:r>
           </w:p>
         </w:tc>
       </w:tr>
       <w:tr>
-        <w:tc>
-          <w:tcPr>
-            <w:tcW w:w="1255" w:type="dxa"/>
+        <w:trPr>
+          <w:trHeight w:val="465"/>
+          <w:jc w:val="center"/>
+        </w:trPr>
+        <w:tc>
+          <w:tcPr>
+            <w:tcW w:w="0" w:type="auto"/>
           </w:tcPr>
           <w:p>
             <w:pPr>
@@ -252,55 +201,76 @@
               </w:rPr>
               <w:t>FHN</w:t>
             </w:r>
-          </w:p>
-        </w:tc>
-        <w:tc>
-          <w:tcPr>
-            <w:tcW w:w="1282" w:type="dxa"/>
-          </w:tcPr>
-          <w:p>
-            <w:pPr>
-              <w:rPr>
-                <w:rFonts w:ascii="Helvetica" w:hAnsi="Helvetica" w:cs="Helvetica"/>
-                <w:sz w:val="20"/>
-                <w:szCs w:val="20"/>
-              </w:rPr>
-            </w:pPr>
-            <w:r>
-              <w:rPr>
-                <w:rFonts w:ascii="Helvetica" w:hAnsi="Helvetica" w:cs="Helvetica"/>
-                <w:sz w:val="20"/>
-                <w:szCs w:val="20"/>
-              </w:rPr>
-              <w:t>No</w:t>
-            </w:r>
-          </w:p>
-        </w:tc>
-        <w:tc>
-          <w:tcPr>
-            <w:tcW w:w="1461" w:type="dxa"/>
-          </w:tcPr>
-          <w:p>
-            <w:pPr>
-              <w:rPr>
-                <w:rFonts w:ascii="Helvetica" w:hAnsi="Helvetica" w:cs="Helvetica"/>
-                <w:sz w:val="20"/>
-                <w:szCs w:val="20"/>
-              </w:rPr>
-            </w:pPr>
-            <w:r>
-              <w:rPr>
-                <w:rFonts w:ascii="Helvetica" w:hAnsi="Helvetica" w:cs="Helvetica"/>
-                <w:sz w:val="20"/>
-                <w:szCs w:val="20"/>
-              </w:rPr>
-              <w:t>Degree-3 polynomials</w:t>
-            </w:r>
-          </w:p>
-        </w:tc>
-        <w:tc>
-          <w:tcPr>
-            <w:tcW w:w="1186" w:type="dxa"/>
+            <w:r>
+              <w:rPr>
+                <w:rFonts w:ascii="Helvetica" w:hAnsi="Helvetica" w:cs="Helvetica"/>
+                <w:sz w:val="20"/>
+                <w:szCs w:val="20"/>
+              </w:rPr>
+              <w:t xml:space="preserve"> </w:t>
+            </w:r>
+          </w:p>
+          <w:p>
+            <w:pPr>
+              <w:rPr>
+                <w:rFonts w:ascii="Helvetica" w:hAnsi="Helvetica" w:cs="Helvetica"/>
+                <w:sz w:val="20"/>
+                <w:szCs w:val="20"/>
+              </w:rPr>
+            </w:pPr>
+            <w:r>
+              <w:rPr>
+                <w:rFonts w:ascii="Helvetica" w:hAnsi="Helvetica" w:cs="Helvetica"/>
+                <w:sz w:val="20"/>
+                <w:szCs w:val="20"/>
+              </w:rPr>
+              <w:t>(</w:t>
+            </w:r>
+            <m:oMath>
+              <m:r>
+                <w:rPr>
+                  <w:rFonts w:ascii="Cambria Math" w:hAnsi="Cambria Math" w:cs="Helvetica"/>
+                  <w:sz w:val="20"/>
+                  <w:szCs w:val="20"/>
+                </w:rPr>
+                <m:t>ϵ=0.01</m:t>
+              </m:r>
+            </m:oMath>
+            <w:r>
+              <w:rPr>
+                <w:rFonts w:ascii="Helvetica" w:eastAsiaTheme="minorEastAsia" w:hAnsi="Helvetica" w:cs="Helvetica"/>
+                <w:sz w:val="20"/>
+                <w:szCs w:val="20"/>
+              </w:rPr>
+              <w:t>)</w:t>
+            </w:r>
+          </w:p>
+        </w:tc>
+        <w:tc>
+          <w:tcPr>
+            <w:tcW w:w="0" w:type="auto"/>
+          </w:tcPr>
+          <w:p>
+            <w:pPr>
+              <w:rPr>
+                <w:rFonts w:ascii="Helvetica" w:hAnsi="Helvetica" w:cs="Helvetica"/>
+                <w:sz w:val="20"/>
+                <w:szCs w:val="20"/>
+              </w:rPr>
+            </w:pPr>
+            <w:r>
+              <w:rPr>
+                <w:rFonts w:ascii="Helvetica" w:hAnsi="Helvetica" w:cs="Helvetica"/>
+                <w:sz w:val="20"/>
+                <w:szCs w:val="20"/>
+              </w:rPr>
+              <w:t>Poly3</w:t>
+            </w:r>
+          </w:p>
+        </w:tc>
+        <w:tc>
+          <w:tcPr>
+            <w:tcW w:w="0" w:type="auto"/>
           </w:tcPr>
           <w:p>
             <w:pPr>
@@ -322,7 +292,7 @@
         </w:tc>
         <w:tc>
           <w:tcPr>
-            <w:tcW w:w="1327" w:type="dxa"/>
+            <w:tcW w:w="0" w:type="auto"/>
           </w:tcPr>
           <w:p>
             <w:pPr>
@@ -344,7 +314,7 @@
         </w:tc>
         <w:tc>
           <w:tcPr>
-            <w:tcW w:w="1349" w:type="dxa"/>
+            <w:tcW w:w="1547" w:type="dxa"/>
           </w:tcPr>
           <w:p>
             <w:pPr>
@@ -361,78 +331,46 @@
                 <w:szCs w:val="20"/>
               </w:rPr>
               <w:t>High</w:t>
-            </w:r>
-          </w:p>
-        </w:tc>
-        <w:tc>
-          <w:tcPr>
-            <w:tcW w:w="1675" w:type="dxa"/>
-          </w:tcPr>
-          <w:p>
-            <w:pPr>
-              <w:rPr>
-                <w:rFonts w:ascii="Helvetica" w:hAnsi="Helvetica" w:cs="Helvetica"/>
-                <w:sz w:val="20"/>
-                <w:szCs w:val="20"/>
-              </w:rPr>
-            </w:pPr>
-            <w:r>
-              <w:rPr>
-                <w:rFonts w:ascii="Helvetica" w:hAnsi="Helvetica" w:cs="Helvetica"/>
-                <w:sz w:val="20"/>
-                <w:szCs w:val="20"/>
-              </w:rPr>
-              <w:t>Thresh=0.001</w:t>
             </w:r>
           </w:p>
         </w:tc>
       </w:tr>
       <w:tr>
-        <w:tc>
-          <w:tcPr>
-            <w:tcW w:w="1255" w:type="dxa"/>
-          </w:tcPr>
-          <w:p>
-            <w:pPr>
-              <w:rPr>
-                <w:rFonts w:ascii="Helvetica" w:hAnsi="Helvetica" w:cs="Helvetica"/>
-                <w:sz w:val="20"/>
-                <w:szCs w:val="20"/>
-              </w:rPr>
-            </w:pPr>
-          </w:p>
-        </w:tc>
-        <w:tc>
-          <w:tcPr>
-            <w:tcW w:w="1282" w:type="dxa"/>
-          </w:tcPr>
-          <w:p>
-            <w:pPr>
-              <w:rPr>
-                <w:rFonts w:ascii="Helvetica" w:hAnsi="Helvetica" w:cs="Helvetica"/>
-                <w:sz w:val="20"/>
-                <w:szCs w:val="20"/>
-              </w:rPr>
-            </w:pPr>
-          </w:p>
-        </w:tc>
-        <w:tc>
-          <w:tcPr>
-            <w:tcW w:w="1461" w:type="dxa"/>
-          </w:tcPr>
-          <w:p>
-            <w:pPr>
-              <w:rPr>
-                <w:rFonts w:ascii="Helvetica" w:hAnsi="Helvetica" w:cs="Helvetica"/>
-                <w:sz w:val="20"/>
-                <w:szCs w:val="20"/>
-              </w:rPr>
-            </w:pPr>
-          </w:p>
-        </w:tc>
-        <w:tc>
-          <w:tcPr>
-            <w:tcW w:w="1186" w:type="dxa"/>
+        <w:trPr>
+          <w:trHeight w:val="465"/>
+          <w:jc w:val="center"/>
+        </w:trPr>
+        <w:tc>
+          <w:tcPr>
+            <w:tcW w:w="0" w:type="auto"/>
+          </w:tcPr>
+          <w:p>
+            <w:pPr>
+              <w:rPr>
+                <w:rFonts w:ascii="Helvetica" w:hAnsi="Helvetica" w:cs="Helvetica"/>
+                <w:sz w:val="20"/>
+                <w:szCs w:val="20"/>
+              </w:rPr>
+            </w:pPr>
+          </w:p>
+        </w:tc>
+        <w:tc>
+          <w:tcPr>
+            <w:tcW w:w="0" w:type="auto"/>
+          </w:tcPr>
+          <w:p>
+            <w:pPr>
+              <w:rPr>
+                <w:rFonts w:ascii="Helvetica" w:hAnsi="Helvetica" w:cs="Helvetica"/>
+                <w:sz w:val="20"/>
+                <w:szCs w:val="20"/>
+              </w:rPr>
+            </w:pPr>
+          </w:p>
+        </w:tc>
+        <w:tc>
+          <w:tcPr>
+            <w:tcW w:w="0" w:type="auto"/>
           </w:tcPr>
           <w:p>
             <w:pPr>
@@ -454,7 +392,7 @@
         </w:tc>
         <w:tc>
           <w:tcPr>
-            <w:tcW w:w="1327" w:type="dxa"/>
+            <w:tcW w:w="0" w:type="auto"/>
           </w:tcPr>
           <w:p>
             <w:pPr>
@@ -476,7 +414,7 @@
         </w:tc>
         <w:tc>
           <w:tcPr>
-            <w:tcW w:w="1349" w:type="dxa"/>
+            <w:tcW w:w="1547" w:type="dxa"/>
           </w:tcPr>
           <w:p>
             <w:pPr>
@@ -493,97 +431,46 @@
                 <w:szCs w:val="20"/>
               </w:rPr>
               <w:t>High</w:t>
-            </w:r>
-          </w:p>
-        </w:tc>
-        <w:tc>
-          <w:tcPr>
-            <w:tcW w:w="1675" w:type="dxa"/>
-          </w:tcPr>
-          <w:p>
-            <w:pPr>
-              <w:rPr>
-                <w:rFonts w:ascii="Helvetica" w:hAnsi="Helvetica" w:cs="Helvetica"/>
-                <w:sz w:val="20"/>
-                <w:szCs w:val="20"/>
-              </w:rPr>
-            </w:pPr>
-            <w:r>
-              <w:rPr>
-                <w:rFonts w:ascii="Helvetica" w:hAnsi="Helvetica" w:cs="Helvetica"/>
-                <w:sz w:val="20"/>
-                <w:szCs w:val="20"/>
-              </w:rPr>
-              <w:t>Thresh=</w:t>
-            </w:r>
-            <w:r>
-              <w:rPr>
-                <w:rFonts w:ascii="Consolas" w:eastAsia="Times New Roman" w:hAnsi="Consolas" w:cs="Times New Roman"/>
-                <w:color w:val="B5CEA8"/>
-                <w:kern w:val="0"/>
-                <w:sz w:val="20"/>
-                <w:szCs w:val="20"/>
-                <w14:ligatures w14:val="none"/>
-              </w:rPr>
-              <w:t xml:space="preserve"> </w:t>
-            </w:r>
-            <w:r>
-              <w:rPr>
-                <w:rFonts w:ascii="Helvetica" w:hAnsi="Helvetica" w:cs="Helvetica"/>
-                <w:sz w:val="20"/>
-                <w:szCs w:val="20"/>
-              </w:rPr>
-              <w:t>0.0001</w:t>
             </w:r>
           </w:p>
         </w:tc>
       </w:tr>
       <w:tr>
-        <w:tc>
-          <w:tcPr>
-            <w:tcW w:w="1255" w:type="dxa"/>
-          </w:tcPr>
-          <w:p>
-            <w:pPr>
-              <w:rPr>
-                <w:rFonts w:ascii="Helvetica" w:hAnsi="Helvetica" w:cs="Helvetica"/>
-                <w:sz w:val="20"/>
-                <w:szCs w:val="20"/>
-              </w:rPr>
-            </w:pPr>
-          </w:p>
-        </w:tc>
-        <w:tc>
-          <w:tcPr>
-            <w:tcW w:w="1282" w:type="dxa"/>
-          </w:tcPr>
-          <w:p>
-            <w:pPr>
-              <w:rPr>
-                <w:rFonts w:ascii="Helvetica" w:hAnsi="Helvetica" w:cs="Helvetica"/>
-                <w:sz w:val="20"/>
-                <w:szCs w:val="20"/>
-              </w:rPr>
-            </w:pPr>
-          </w:p>
-        </w:tc>
-        <w:tc>
-          <w:tcPr>
-            <w:tcW w:w="1461" w:type="dxa"/>
-          </w:tcPr>
-          <w:p>
-            <w:pPr>
-              <w:rPr>
-                <w:rFonts w:ascii="Helvetica" w:hAnsi="Helvetica" w:cs="Helvetica"/>
-                <w:sz w:val="20"/>
-                <w:szCs w:val="20"/>
-              </w:rPr>
-            </w:pPr>
-          </w:p>
-        </w:tc>
-        <w:tc>
-          <w:tcPr>
-            <w:tcW w:w="1186" w:type="dxa"/>
+        <w:trPr>
+          <w:trHeight w:val="465"/>
+          <w:jc w:val="center"/>
+        </w:trPr>
+        <w:tc>
+          <w:tcPr>
+            <w:tcW w:w="0" w:type="auto"/>
+          </w:tcPr>
+          <w:p>
+            <w:pPr>
+              <w:rPr>
+                <w:rFonts w:ascii="Helvetica" w:hAnsi="Helvetica" w:cs="Helvetica"/>
+                <w:sz w:val="20"/>
+                <w:szCs w:val="20"/>
+              </w:rPr>
+            </w:pPr>
+          </w:p>
+        </w:tc>
+        <w:tc>
+          <w:tcPr>
+            <w:tcW w:w="0" w:type="auto"/>
+          </w:tcPr>
+          <w:p>
+            <w:pPr>
+              <w:rPr>
+                <w:rFonts w:ascii="Helvetica" w:hAnsi="Helvetica" w:cs="Helvetica"/>
+                <w:sz w:val="20"/>
+                <w:szCs w:val="20"/>
+              </w:rPr>
+            </w:pPr>
+          </w:p>
+        </w:tc>
+        <w:tc>
+          <w:tcPr>
+            <w:tcW w:w="0" w:type="auto"/>
           </w:tcPr>
           <w:p>
             <w:pPr>
@@ -605,7 +492,7 @@
         </w:tc>
         <w:tc>
           <w:tcPr>
-            <w:tcW w:w="1327" w:type="dxa"/>
+            <w:tcW w:w="0" w:type="auto"/>
           </w:tcPr>
           <w:p>
             <w:pPr>
@@ -627,7 +514,7 @@
         </w:tc>
         <w:tc>
           <w:tcPr>
-            <w:tcW w:w="1349" w:type="dxa"/>
+            <w:tcW w:w="1547" w:type="dxa"/>
           </w:tcPr>
           <w:p>
             <w:pPr>
@@ -644,72 +531,32 @@
                 <w:szCs w:val="20"/>
               </w:rPr>
               <w:t>Low</w:t>
-            </w:r>
-          </w:p>
-        </w:tc>
-        <w:tc>
-          <w:tcPr>
-            <w:tcW w:w="1675" w:type="dxa"/>
-          </w:tcPr>
-          <w:p>
-            <w:pPr>
-              <w:rPr>
-                <w:rFonts w:ascii="Helvetica" w:hAnsi="Helvetica" w:cs="Helvetica"/>
-                <w:sz w:val="20"/>
-                <w:szCs w:val="20"/>
-              </w:rPr>
-            </w:pPr>
-            <w:r>
-              <w:rPr>
-                <w:rFonts w:ascii="Helvetica" w:hAnsi="Helvetica" w:cs="Helvetica"/>
-                <w:sz w:val="20"/>
-                <w:szCs w:val="20"/>
-              </w:rPr>
-              <w:t>α=0.</w:t>
-            </w:r>
-            <w:r>
-              <w:rPr>
-                <w:rFonts w:ascii="Helvetica" w:hAnsi="Helvetica" w:cs="Helvetica"/>
-                <w:sz w:val="20"/>
-                <w:szCs w:val="20"/>
-              </w:rPr>
-              <w:t>5</w:t>
             </w:r>
           </w:p>
         </w:tc>
       </w:tr>
       <w:tr>
-        <w:tc>
-          <w:tcPr>
-            <w:tcW w:w="1255" w:type="dxa"/>
-          </w:tcPr>
-          <w:p>
-            <w:pPr>
-              <w:rPr>
-                <w:rFonts w:ascii="Helvetica" w:hAnsi="Helvetica" w:cs="Helvetica"/>
-                <w:sz w:val="20"/>
-                <w:szCs w:val="20"/>
-              </w:rPr>
-            </w:pPr>
-          </w:p>
-        </w:tc>
-        <w:tc>
-          <w:tcPr>
-            <w:tcW w:w="1282" w:type="dxa"/>
-          </w:tcPr>
-          <w:p>
-            <w:pPr>
-              <w:rPr>
-                <w:rFonts w:ascii="Helvetica" w:hAnsi="Helvetica" w:cs="Helvetica"/>
-                <w:sz w:val="20"/>
-                <w:szCs w:val="20"/>
-              </w:rPr>
-            </w:pPr>
-          </w:p>
-        </w:tc>
-        <w:tc>
-          <w:tcPr>
-            <w:tcW w:w="1461" w:type="dxa"/>
+        <w:trPr>
+          <w:trHeight w:val="465"/>
+          <w:jc w:val="center"/>
+        </w:trPr>
+        <w:tc>
+          <w:tcPr>
+            <w:tcW w:w="0" w:type="auto"/>
+          </w:tcPr>
+          <w:p>
+            <w:pPr>
+              <w:rPr>
+                <w:rFonts w:ascii="Helvetica" w:hAnsi="Helvetica" w:cs="Helvetica"/>
+                <w:sz w:val="20"/>
+                <w:szCs w:val="20"/>
+              </w:rPr>
+            </w:pPr>
+          </w:p>
+        </w:tc>
+        <w:tc>
+          <w:tcPr>
+            <w:tcW w:w="0" w:type="auto"/>
           </w:tcPr>
           <w:p>
             <w:pPr>
@@ -731,21 +578,21 @@
         </w:tc>
         <w:tc>
           <w:tcPr>
-            <w:tcW w:w="1186" w:type="dxa"/>
-          </w:tcPr>
-          <w:p>
-            <w:pPr>
-              <w:rPr>
-                <w:rFonts w:ascii="Helvetica" w:hAnsi="Helvetica" w:cs="Helvetica"/>
-                <w:sz w:val="20"/>
-                <w:szCs w:val="20"/>
-              </w:rPr>
-            </w:pPr>
-          </w:p>
-        </w:tc>
-        <w:tc>
-          <w:tcPr>
-            <w:tcW w:w="1327" w:type="dxa"/>
+            <w:tcW w:w="0" w:type="auto"/>
+          </w:tcPr>
+          <w:p>
+            <w:pPr>
+              <w:rPr>
+                <w:rFonts w:ascii="Helvetica" w:hAnsi="Helvetica" w:cs="Helvetica"/>
+                <w:sz w:val="20"/>
+                <w:szCs w:val="20"/>
+              </w:rPr>
+            </w:pPr>
+          </w:p>
+        </w:tc>
+        <w:tc>
+          <w:tcPr>
+            <w:tcW w:w="0" w:type="auto"/>
           </w:tcPr>
           <w:p>
             <w:pPr>
@@ -767,21 +614,7 @@
         </w:tc>
         <w:tc>
           <w:tcPr>
-            <w:tcW w:w="1349" w:type="dxa"/>
-          </w:tcPr>
-          <w:p>
-            <w:pPr>
-              <w:rPr>
-                <w:rFonts w:ascii="Helvetica" w:hAnsi="Helvetica" w:cs="Helvetica"/>
-                <w:sz w:val="20"/>
-                <w:szCs w:val="20"/>
-              </w:rPr>
-            </w:pPr>
-          </w:p>
-        </w:tc>
-        <w:tc>
-          <w:tcPr>
-            <w:tcW w:w="1675" w:type="dxa"/>
+            <w:tcW w:w="1547" w:type="dxa"/>
           </w:tcPr>
           <w:p>
             <w:pPr>
@@ -795,9 +628,13 @@
         </w:tc>
       </w:tr>
       <w:tr>
-        <w:tc>
-          <w:tcPr>
-            <w:tcW w:w="1255" w:type="dxa"/>
+        <w:trPr>
+          <w:trHeight w:val="465"/>
+          <w:jc w:val="center"/>
+        </w:trPr>
+        <w:tc>
+          <w:tcPr>
+            <w:tcW w:w="0" w:type="auto"/>
           </w:tcPr>
           <w:p>
             <w:pPr>
@@ -815,47 +652,76 @@
               </w:rPr>
               <w:t>FHN-c</w:t>
             </w:r>
-          </w:p>
-        </w:tc>
-        <w:tc>
-          <w:tcPr>
-            <w:tcW w:w="1282" w:type="dxa"/>
-          </w:tcPr>
-          <w:p>
-            <w:pPr>
-              <w:rPr>
-                <w:rFonts w:ascii="Helvetica" w:hAnsi="Helvetica" w:cs="Helvetica"/>
-                <w:sz w:val="20"/>
-                <w:szCs w:val="20"/>
-              </w:rPr>
-            </w:pPr>
-          </w:p>
-        </w:tc>
-        <w:tc>
-          <w:tcPr>
-            <w:tcW w:w="1461" w:type="dxa"/>
-          </w:tcPr>
-          <w:p>
-            <w:pPr>
-              <w:rPr>
-                <w:rFonts w:ascii="Helvetica" w:hAnsi="Helvetica" w:cs="Helvetica"/>
-                <w:sz w:val="20"/>
-                <w:szCs w:val="20"/>
-              </w:rPr>
-            </w:pPr>
-            <w:r>
-              <w:rPr>
-                <w:rFonts w:ascii="Helvetica" w:hAnsi="Helvetica" w:cs="Helvetica"/>
-                <w:sz w:val="20"/>
-                <w:szCs w:val="20"/>
-              </w:rPr>
-              <w:t>Degree-3 polynomials</w:t>
-            </w:r>
-          </w:p>
-        </w:tc>
-        <w:tc>
-          <w:tcPr>
-            <w:tcW w:w="1186" w:type="dxa"/>
+            <w:r>
+              <w:rPr>
+                <w:rFonts w:ascii="Helvetica" w:hAnsi="Helvetica" w:cs="Helvetica"/>
+                <w:sz w:val="20"/>
+                <w:szCs w:val="20"/>
+              </w:rPr>
+              <w:t xml:space="preserve"> </w:t>
+            </w:r>
+          </w:p>
+          <w:p>
+            <w:pPr>
+              <w:rPr>
+                <w:rFonts w:ascii="Helvetica" w:hAnsi="Helvetica" w:cs="Helvetica"/>
+                <w:sz w:val="20"/>
+                <w:szCs w:val="20"/>
+              </w:rPr>
+            </w:pPr>
+            <w:r>
+              <w:rPr>
+                <w:rFonts w:ascii="Helvetica" w:hAnsi="Helvetica" w:cs="Helvetica"/>
+                <w:sz w:val="20"/>
+                <w:szCs w:val="20"/>
+              </w:rPr>
+              <w:t>(</w:t>
+            </w:r>
+            <m:oMath>
+              <m:r>
+                <w:rPr>
+                  <w:rFonts w:ascii="Cambria Math" w:hAnsi="Cambria Math" w:cs="Helvetica"/>
+                  <w:sz w:val="20"/>
+                  <w:szCs w:val="20"/>
+                </w:rPr>
+                <m:t>ϵ=0.01</m:t>
+              </m:r>
+            </m:oMath>
+            <w:r>
+              <w:rPr>
+                <w:rFonts w:ascii="Helvetica" w:eastAsiaTheme="minorEastAsia" w:hAnsi="Helvetica" w:cs="Helvetica"/>
+                <w:sz w:val="20"/>
+                <w:szCs w:val="20"/>
+              </w:rPr>
+              <w:t>)</w:t>
+            </w:r>
+          </w:p>
+        </w:tc>
+        <w:tc>
+          <w:tcPr>
+            <w:tcW w:w="0" w:type="auto"/>
+          </w:tcPr>
+          <w:p>
+            <w:pPr>
+              <w:rPr>
+                <w:rFonts w:ascii="Helvetica" w:hAnsi="Helvetica" w:cs="Helvetica"/>
+                <w:sz w:val="20"/>
+                <w:szCs w:val="20"/>
+              </w:rPr>
+            </w:pPr>
+            <w:r>
+              <w:rPr>
+                <w:rFonts w:ascii="Helvetica" w:hAnsi="Helvetica" w:cs="Helvetica"/>
+                <w:sz w:val="20"/>
+                <w:szCs w:val="20"/>
+              </w:rPr>
+              <w:t>Poly3</w:t>
+            </w:r>
+          </w:p>
+        </w:tc>
+        <w:tc>
+          <w:tcPr>
+            <w:tcW w:w="0" w:type="auto"/>
           </w:tcPr>
           <w:p>
             <w:pPr>
@@ -877,7 +743,7 @@
         </w:tc>
         <w:tc>
           <w:tcPr>
-            <w:tcW w:w="1327" w:type="dxa"/>
+            <w:tcW w:w="0" w:type="auto"/>
           </w:tcPr>
           <w:p>
             <w:pPr>
@@ -899,21 +765,7 @@
         </w:tc>
         <w:tc>
           <w:tcPr>
-            <w:tcW w:w="1349" w:type="dxa"/>
-          </w:tcPr>
-          <w:p>
-            <w:pPr>
-              <w:rPr>
-                <w:rFonts w:ascii="Helvetica" w:hAnsi="Helvetica" w:cs="Helvetica"/>
-                <w:sz w:val="20"/>
-                <w:szCs w:val="20"/>
-              </w:rPr>
-            </w:pPr>
-          </w:p>
-        </w:tc>
-        <w:tc>
-          <w:tcPr>
-            <w:tcW w:w="1675" w:type="dxa"/>
+            <w:tcW w:w="1547" w:type="dxa"/>
           </w:tcPr>
           <w:p>
             <w:pPr>
@@ -927,51 +779,41 @@
         </w:tc>
       </w:tr>
       <w:tr>
-        <w:tc>
-          <w:tcPr>
-            <w:tcW w:w="1255" w:type="dxa"/>
-          </w:tcPr>
-          <w:p>
-            <w:pPr>
-              <w:rPr>
-                <w:rFonts w:ascii="Helvetica" w:hAnsi="Helvetica" w:cs="Helvetica"/>
-                <w:sz w:val="20"/>
-                <w:szCs w:val="20"/>
-              </w:rPr>
-            </w:pPr>
-          </w:p>
-        </w:tc>
-        <w:tc>
-          <w:tcPr>
-            <w:tcW w:w="1282" w:type="dxa"/>
-          </w:tcPr>
-          <w:p>
-            <w:pPr>
-              <w:rPr>
-                <w:rFonts w:ascii="Helvetica" w:hAnsi="Helvetica" w:cs="Helvetica"/>
-                <w:sz w:val="20"/>
-                <w:szCs w:val="20"/>
-              </w:rPr>
-            </w:pPr>
-          </w:p>
-        </w:tc>
-        <w:tc>
-          <w:tcPr>
-            <w:tcW w:w="1461" w:type="dxa"/>
-          </w:tcPr>
-          <w:p>
-            <w:pPr>
-              <w:rPr>
-                <w:rFonts w:ascii="Helvetica" w:hAnsi="Helvetica" w:cs="Helvetica"/>
-                <w:sz w:val="20"/>
-                <w:szCs w:val="20"/>
-              </w:rPr>
-            </w:pPr>
-          </w:p>
-        </w:tc>
-        <w:tc>
-          <w:tcPr>
-            <w:tcW w:w="1186" w:type="dxa"/>
+        <w:trPr>
+          <w:trHeight w:val="465"/>
+          <w:jc w:val="center"/>
+        </w:trPr>
+        <w:tc>
+          <w:tcPr>
+            <w:tcW w:w="0" w:type="auto"/>
+          </w:tcPr>
+          <w:p>
+            <w:pPr>
+              <w:rPr>
+                <w:rFonts w:ascii="Helvetica" w:hAnsi="Helvetica" w:cs="Helvetica"/>
+                <w:sz w:val="20"/>
+                <w:szCs w:val="20"/>
+              </w:rPr>
+            </w:pPr>
+          </w:p>
+        </w:tc>
+        <w:tc>
+          <w:tcPr>
+            <w:tcW w:w="0" w:type="auto"/>
+          </w:tcPr>
+          <w:p>
+            <w:pPr>
+              <w:rPr>
+                <w:rFonts w:ascii="Helvetica" w:hAnsi="Helvetica" w:cs="Helvetica"/>
+                <w:sz w:val="20"/>
+                <w:szCs w:val="20"/>
+              </w:rPr>
+            </w:pPr>
+          </w:p>
+        </w:tc>
+        <w:tc>
+          <w:tcPr>
+            <w:tcW w:w="0" w:type="auto"/>
           </w:tcPr>
           <w:p>
             <w:pPr>
@@ -993,7 +835,7 @@
         </w:tc>
         <w:tc>
           <w:tcPr>
-            <w:tcW w:w="1327" w:type="dxa"/>
+            <w:tcW w:w="0" w:type="auto"/>
           </w:tcPr>
           <w:p>
             <w:pPr>
@@ -1015,21 +857,7 @@
         </w:tc>
         <w:tc>
           <w:tcPr>
-            <w:tcW w:w="1349" w:type="dxa"/>
-          </w:tcPr>
-          <w:p>
-            <w:pPr>
-              <w:rPr>
-                <w:rFonts w:ascii="Helvetica" w:hAnsi="Helvetica" w:cs="Helvetica"/>
-                <w:sz w:val="20"/>
-                <w:szCs w:val="20"/>
-              </w:rPr>
-            </w:pPr>
-          </w:p>
-        </w:tc>
-        <w:tc>
-          <w:tcPr>
-            <w:tcW w:w="1675" w:type="dxa"/>
+            <w:tcW w:w="1547" w:type="dxa"/>
           </w:tcPr>
           <w:p>
             <w:pPr>
@@ -1043,51 +871,41 @@
         </w:tc>
       </w:tr>
       <w:tr>
-        <w:tc>
-          <w:tcPr>
-            <w:tcW w:w="1255" w:type="dxa"/>
-          </w:tcPr>
-          <w:p>
-            <w:pPr>
-              <w:rPr>
-                <w:rFonts w:ascii="Helvetica" w:hAnsi="Helvetica" w:cs="Helvetica"/>
-                <w:sz w:val="20"/>
-                <w:szCs w:val="20"/>
-              </w:rPr>
-            </w:pPr>
-          </w:p>
-        </w:tc>
-        <w:tc>
-          <w:tcPr>
-            <w:tcW w:w="1282" w:type="dxa"/>
-          </w:tcPr>
-          <w:p>
-            <w:pPr>
-              <w:rPr>
-                <w:rFonts w:ascii="Helvetica" w:hAnsi="Helvetica" w:cs="Helvetica"/>
-                <w:sz w:val="20"/>
-                <w:szCs w:val="20"/>
-              </w:rPr>
-            </w:pPr>
-          </w:p>
-        </w:tc>
-        <w:tc>
-          <w:tcPr>
-            <w:tcW w:w="1461" w:type="dxa"/>
-          </w:tcPr>
-          <w:p>
-            <w:pPr>
-              <w:rPr>
-                <w:rFonts w:ascii="Helvetica" w:hAnsi="Helvetica" w:cs="Helvetica"/>
-                <w:sz w:val="20"/>
-                <w:szCs w:val="20"/>
-              </w:rPr>
-            </w:pPr>
-          </w:p>
-        </w:tc>
-        <w:tc>
-          <w:tcPr>
-            <w:tcW w:w="1186" w:type="dxa"/>
+        <w:trPr>
+          <w:trHeight w:val="465"/>
+          <w:jc w:val="center"/>
+        </w:trPr>
+        <w:tc>
+          <w:tcPr>
+            <w:tcW w:w="0" w:type="auto"/>
+          </w:tcPr>
+          <w:p>
+            <w:pPr>
+              <w:rPr>
+                <w:rFonts w:ascii="Helvetica" w:hAnsi="Helvetica" w:cs="Helvetica"/>
+                <w:sz w:val="20"/>
+                <w:szCs w:val="20"/>
+              </w:rPr>
+            </w:pPr>
+          </w:p>
+        </w:tc>
+        <w:tc>
+          <w:tcPr>
+            <w:tcW w:w="0" w:type="auto"/>
+          </w:tcPr>
+          <w:p>
+            <w:pPr>
+              <w:rPr>
+                <w:rFonts w:ascii="Helvetica" w:hAnsi="Helvetica" w:cs="Helvetica"/>
+                <w:sz w:val="20"/>
+                <w:szCs w:val="20"/>
+              </w:rPr>
+            </w:pPr>
+          </w:p>
+        </w:tc>
+        <w:tc>
+          <w:tcPr>
+            <w:tcW w:w="0" w:type="auto"/>
           </w:tcPr>
           <w:p>
             <w:pPr>
@@ -1109,7 +927,7 @@
         </w:tc>
         <w:tc>
           <w:tcPr>
-            <w:tcW w:w="1327" w:type="dxa"/>
+            <w:tcW w:w="0" w:type="auto"/>
           </w:tcPr>
           <w:p>
             <w:pPr>
@@ -1131,7 +949,7 @@
         </w:tc>
         <w:tc>
           <w:tcPr>
-            <w:tcW w:w="1349" w:type="dxa"/>
+            <w:tcW w:w="1547" w:type="dxa"/>
           </w:tcPr>
           <w:p>
             <w:pPr>
@@ -1148,72 +966,32 @@
                 <w:szCs w:val="20"/>
               </w:rPr>
               <w:t>Low</w:t>
-            </w:r>
-          </w:p>
-        </w:tc>
-        <w:tc>
-          <w:tcPr>
-            <w:tcW w:w="1675" w:type="dxa"/>
-          </w:tcPr>
-          <w:p>
-            <w:pPr>
-              <w:rPr>
-                <w:rFonts w:ascii="Helvetica" w:hAnsi="Helvetica" w:cs="Helvetica"/>
-                <w:sz w:val="20"/>
-                <w:szCs w:val="20"/>
-              </w:rPr>
-            </w:pPr>
-            <w:r>
-              <w:rPr>
-                <w:rFonts w:ascii="Helvetica" w:hAnsi="Helvetica" w:cs="Helvetica"/>
-                <w:sz w:val="20"/>
-                <w:szCs w:val="20"/>
-              </w:rPr>
-              <w:t>α=0.</w:t>
-            </w:r>
-            <w:r>
-              <w:rPr>
-                <w:rFonts w:ascii="Helvetica" w:hAnsi="Helvetica" w:cs="Helvetica"/>
-                <w:sz w:val="20"/>
-                <w:szCs w:val="20"/>
-              </w:rPr>
-              <w:t>5</w:t>
             </w:r>
           </w:p>
         </w:tc>
       </w:tr>
       <w:tr>
-        <w:tc>
-          <w:tcPr>
-            <w:tcW w:w="1255" w:type="dxa"/>
-          </w:tcPr>
-          <w:p>
-            <w:pPr>
-              <w:rPr>
-                <w:rFonts w:ascii="Helvetica" w:hAnsi="Helvetica" w:cs="Helvetica"/>
-                <w:sz w:val="20"/>
-                <w:szCs w:val="20"/>
-              </w:rPr>
-            </w:pPr>
-          </w:p>
-        </w:tc>
-        <w:tc>
-          <w:tcPr>
-            <w:tcW w:w="1282" w:type="dxa"/>
-          </w:tcPr>
-          <w:p>
-            <w:pPr>
-              <w:rPr>
-                <w:rFonts w:ascii="Helvetica" w:hAnsi="Helvetica" w:cs="Helvetica"/>
-                <w:sz w:val="20"/>
-                <w:szCs w:val="20"/>
-              </w:rPr>
-            </w:pPr>
-          </w:p>
-        </w:tc>
-        <w:tc>
-          <w:tcPr>
-            <w:tcW w:w="1461" w:type="dxa"/>
+        <w:trPr>
+          <w:trHeight w:val="465"/>
+          <w:jc w:val="center"/>
+        </w:trPr>
+        <w:tc>
+          <w:tcPr>
+            <w:tcW w:w="0" w:type="auto"/>
+          </w:tcPr>
+          <w:p>
+            <w:pPr>
+              <w:rPr>
+                <w:rFonts w:ascii="Helvetica" w:hAnsi="Helvetica" w:cs="Helvetica"/>
+                <w:sz w:val="20"/>
+                <w:szCs w:val="20"/>
+              </w:rPr>
+            </w:pPr>
+          </w:p>
+        </w:tc>
+        <w:tc>
+          <w:tcPr>
+            <w:tcW w:w="0" w:type="auto"/>
           </w:tcPr>
           <w:p>
             <w:pPr>
@@ -1235,21 +1013,21 @@
         </w:tc>
         <w:tc>
           <w:tcPr>
-            <w:tcW w:w="1186" w:type="dxa"/>
-          </w:tcPr>
-          <w:p>
-            <w:pPr>
-              <w:rPr>
-                <w:rFonts w:ascii="Helvetica" w:hAnsi="Helvetica" w:cs="Helvetica"/>
-                <w:sz w:val="20"/>
-                <w:szCs w:val="20"/>
-              </w:rPr>
-            </w:pPr>
-          </w:p>
-        </w:tc>
-        <w:tc>
-          <w:tcPr>
-            <w:tcW w:w="1327" w:type="dxa"/>
+            <w:tcW w:w="0" w:type="auto"/>
+          </w:tcPr>
+          <w:p>
+            <w:pPr>
+              <w:rPr>
+                <w:rFonts w:ascii="Helvetica" w:hAnsi="Helvetica" w:cs="Helvetica"/>
+                <w:sz w:val="20"/>
+                <w:szCs w:val="20"/>
+              </w:rPr>
+            </w:pPr>
+          </w:p>
+        </w:tc>
+        <w:tc>
+          <w:tcPr>
+            <w:tcW w:w="0" w:type="auto"/>
           </w:tcPr>
           <w:p>
             <w:pPr>
@@ -1271,21 +1049,7 @@
         </w:tc>
         <w:tc>
           <w:tcPr>
-            <w:tcW w:w="1349" w:type="dxa"/>
-          </w:tcPr>
-          <w:p>
-            <w:pPr>
-              <w:rPr>
-                <w:rFonts w:ascii="Helvetica" w:hAnsi="Helvetica" w:cs="Helvetica"/>
-                <w:sz w:val="20"/>
-                <w:szCs w:val="20"/>
-              </w:rPr>
-            </w:pPr>
-          </w:p>
-        </w:tc>
-        <w:tc>
-          <w:tcPr>
-            <w:tcW w:w="1675" w:type="dxa"/>
+            <w:tcW w:w="1547" w:type="dxa"/>
           </w:tcPr>
           <w:p>
             <w:pPr>
@@ -1299,9 +1063,13 @@
         </w:tc>
       </w:tr>
       <w:tr>
-        <w:tc>
-          <w:tcPr>
-            <w:tcW w:w="1255" w:type="dxa"/>
+        <w:trPr>
+          <w:trHeight w:val="465"/>
+          <w:jc w:val="center"/>
+        </w:trPr>
+        <w:tc>
+          <w:tcPr>
+            <w:tcW w:w="0" w:type="auto"/>
           </w:tcPr>
           <w:p>
             <w:pPr>
@@ -1319,61 +1087,90 @@
               </w:rPr>
               <w:t>VF-FHN-a</w:t>
             </w:r>
-          </w:p>
-        </w:tc>
-        <w:tc>
-          <w:tcPr>
-            <w:tcW w:w="1282" w:type="dxa"/>
-          </w:tcPr>
-          <w:p>
-            <w:pPr>
-              <w:rPr>
-                <w:rFonts w:ascii="Helvetica" w:hAnsi="Helvetica" w:cs="Helvetica"/>
-                <w:sz w:val="20"/>
-                <w:szCs w:val="20"/>
-              </w:rPr>
-            </w:pPr>
-          </w:p>
-        </w:tc>
-        <w:tc>
-          <w:tcPr>
-            <w:tcW w:w="1461" w:type="dxa"/>
-          </w:tcPr>
-          <w:p>
-            <w:pPr>
-              <w:rPr>
-                <w:rFonts w:ascii="Helvetica" w:hAnsi="Helvetica" w:cs="Helvetica"/>
-                <w:sz w:val="20"/>
-                <w:szCs w:val="20"/>
-              </w:rPr>
-            </w:pPr>
-            <w:r>
-              <w:rPr>
-                <w:rFonts w:ascii="Helvetica" w:hAnsi="Helvetica" w:cs="Helvetica"/>
-                <w:sz w:val="20"/>
-                <w:szCs w:val="20"/>
-              </w:rPr>
-              <w:t>Degree-3 polynomials</w:t>
-            </w:r>
-          </w:p>
-        </w:tc>
-        <w:tc>
-          <w:tcPr>
-            <w:tcW w:w="1186" w:type="dxa"/>
-          </w:tcPr>
-          <w:p>
-            <w:pPr>
-              <w:rPr>
-                <w:rFonts w:ascii="Helvetica" w:hAnsi="Helvetica" w:cs="Helvetica"/>
-                <w:sz w:val="20"/>
-                <w:szCs w:val="20"/>
-              </w:rPr>
-            </w:pPr>
-          </w:p>
-        </w:tc>
-        <w:tc>
-          <w:tcPr>
-            <w:tcW w:w="1327" w:type="dxa"/>
+            <w:r>
+              <w:rPr>
+                <w:rFonts w:ascii="Helvetica" w:hAnsi="Helvetica" w:cs="Helvetica"/>
+                <w:sz w:val="20"/>
+                <w:szCs w:val="20"/>
+              </w:rPr>
+              <w:t xml:space="preserve"> </w:t>
+            </w:r>
+          </w:p>
+          <w:p>
+            <w:pPr>
+              <w:rPr>
+                <w:rFonts w:ascii="Helvetica" w:hAnsi="Helvetica" w:cs="Helvetica"/>
+                <w:sz w:val="20"/>
+                <w:szCs w:val="20"/>
+              </w:rPr>
+            </w:pPr>
+            <w:r>
+              <w:rPr>
+                <w:rFonts w:ascii="Helvetica" w:hAnsi="Helvetica" w:cs="Helvetica"/>
+                <w:sz w:val="20"/>
+                <w:szCs w:val="20"/>
+              </w:rPr>
+              <w:t>(</w:t>
+            </w:r>
+            <m:oMath>
+              <m:r>
+                <w:rPr>
+                  <w:rFonts w:ascii="Cambria Math" w:hAnsi="Cambria Math" w:cs="Helvetica"/>
+                  <w:sz w:val="20"/>
+                  <w:szCs w:val="20"/>
+                </w:rPr>
+                <m:t>ϵ=0.01</m:t>
+              </m:r>
+            </m:oMath>
+            <w:r>
+              <w:rPr>
+                <w:rFonts w:ascii="Helvetica" w:eastAsiaTheme="minorEastAsia" w:hAnsi="Helvetica" w:cs="Helvetica"/>
+                <w:sz w:val="20"/>
+                <w:szCs w:val="20"/>
+              </w:rPr>
+              <w:t>)</w:t>
+            </w:r>
+          </w:p>
+        </w:tc>
+        <w:tc>
+          <w:tcPr>
+            <w:tcW w:w="0" w:type="auto"/>
+          </w:tcPr>
+          <w:p>
+            <w:pPr>
+              <w:rPr>
+                <w:rFonts w:ascii="Helvetica" w:hAnsi="Helvetica" w:cs="Helvetica"/>
+                <w:sz w:val="20"/>
+                <w:szCs w:val="20"/>
+              </w:rPr>
+            </w:pPr>
+            <w:r>
+              <w:rPr>
+                <w:rFonts w:ascii="Helvetica" w:hAnsi="Helvetica" w:cs="Helvetica"/>
+                <w:sz w:val="20"/>
+                <w:szCs w:val="20"/>
+              </w:rPr>
+              <w:t>Poly3</w:t>
+            </w:r>
+          </w:p>
+        </w:tc>
+        <w:tc>
+          <w:tcPr>
+            <w:tcW w:w="0" w:type="auto"/>
+          </w:tcPr>
+          <w:p>
+            <w:pPr>
+              <w:rPr>
+                <w:rFonts w:ascii="Helvetica" w:hAnsi="Helvetica" w:cs="Helvetica"/>
+                <w:sz w:val="20"/>
+                <w:szCs w:val="20"/>
+              </w:rPr>
+            </w:pPr>
+          </w:p>
+        </w:tc>
+        <w:tc>
+          <w:tcPr>
+            <w:tcW w:w="0" w:type="auto"/>
           </w:tcPr>
           <w:p>
             <w:pPr>
@@ -1395,7 +1192,7 @@
         </w:tc>
         <w:tc>
           <w:tcPr>
-            <w:tcW w:w="1349" w:type="dxa"/>
+            <w:tcW w:w="1547" w:type="dxa"/>
           </w:tcPr>
           <w:p>
             <w:pPr>
@@ -1412,36 +1209,18 @@
                 <w:szCs w:val="20"/>
               </w:rPr>
               <w:t>Low</w:t>
-            </w:r>
-          </w:p>
-        </w:tc>
-        <w:tc>
-          <w:tcPr>
-            <w:tcW w:w="1675" w:type="dxa"/>
-          </w:tcPr>
-          <w:p>
-            <w:pPr>
-              <w:rPr>
-                <w:rFonts w:ascii="Helvetica" w:hAnsi="Helvetica" w:cs="Helvetica"/>
-                <w:sz w:val="20"/>
-                <w:szCs w:val="20"/>
-              </w:rPr>
-            </w:pPr>
-            <w:r>
-              <w:rPr>
-                <w:rFonts w:ascii="Helvetica" w:hAnsi="Helvetica" w:cs="Helvetica"/>
-                <w:sz w:val="20"/>
-                <w:szCs w:val="20"/>
-              </w:rPr>
-              <w:t>α=0.5</w:t>
             </w:r>
           </w:p>
         </w:tc>
       </w:tr>
       <w:tr>
-        <w:tc>
-          <w:tcPr>
-            <w:tcW w:w="1255" w:type="dxa"/>
+        <w:trPr>
+          <w:trHeight w:val="465"/>
+          <w:jc w:val="center"/>
+        </w:trPr>
+        <w:tc>
+          <w:tcPr>
+            <w:tcW w:w="0" w:type="auto"/>
           </w:tcPr>
           <w:p>
             <w:pPr>
@@ -1459,53 +1238,82 @@
               </w:rPr>
               <w:t>VF-FHN-b</w:t>
             </w:r>
-          </w:p>
-        </w:tc>
-        <w:tc>
-          <w:tcPr>
-            <w:tcW w:w="1282" w:type="dxa"/>
-          </w:tcPr>
-          <w:p>
-            <w:pPr>
-              <w:rPr>
-                <w:rFonts w:ascii="Helvetica" w:hAnsi="Helvetica" w:cs="Helvetica"/>
-                <w:sz w:val="20"/>
-                <w:szCs w:val="20"/>
-              </w:rPr>
-            </w:pPr>
-          </w:p>
-        </w:tc>
-        <w:tc>
-          <w:tcPr>
-            <w:tcW w:w="1461" w:type="dxa"/>
-          </w:tcPr>
-          <w:p>
-            <w:pPr>
-              <w:rPr>
-                <w:rFonts w:ascii="Helvetica" w:hAnsi="Helvetica" w:cs="Helvetica"/>
-                <w:sz w:val="20"/>
-                <w:szCs w:val="20"/>
-              </w:rPr>
-            </w:pPr>
-          </w:p>
-        </w:tc>
-        <w:tc>
-          <w:tcPr>
-            <w:tcW w:w="1186" w:type="dxa"/>
-          </w:tcPr>
-          <w:p>
-            <w:pPr>
-              <w:rPr>
-                <w:rFonts w:ascii="Helvetica" w:hAnsi="Helvetica" w:cs="Helvetica"/>
-                <w:sz w:val="20"/>
-                <w:szCs w:val="20"/>
-              </w:rPr>
-            </w:pPr>
-          </w:p>
-        </w:tc>
-        <w:tc>
-          <w:tcPr>
-            <w:tcW w:w="1327" w:type="dxa"/>
+            <w:r>
+              <w:rPr>
+                <w:rFonts w:ascii="Helvetica" w:hAnsi="Helvetica" w:cs="Helvetica"/>
+                <w:sz w:val="20"/>
+                <w:szCs w:val="20"/>
+              </w:rPr>
+              <w:t xml:space="preserve"> </w:t>
+            </w:r>
+          </w:p>
+          <w:p>
+            <w:pPr>
+              <w:rPr>
+                <w:rFonts w:ascii="Helvetica" w:hAnsi="Helvetica" w:cs="Helvetica"/>
+                <w:sz w:val="20"/>
+                <w:szCs w:val="20"/>
+              </w:rPr>
+            </w:pPr>
+            <w:r>
+              <w:rPr>
+                <w:rFonts w:ascii="Helvetica" w:hAnsi="Helvetica" w:cs="Helvetica"/>
+                <w:sz w:val="20"/>
+                <w:szCs w:val="20"/>
+              </w:rPr>
+              <w:t>(</w:t>
+            </w:r>
+            <m:oMath>
+              <m:r>
+                <w:rPr>
+                  <w:rFonts w:ascii="Cambria Math" w:hAnsi="Cambria Math" w:cs="Helvetica"/>
+                  <w:sz w:val="20"/>
+                  <w:szCs w:val="20"/>
+                </w:rPr>
+                <m:t>ϵ=0.01</m:t>
+              </m:r>
+            </m:oMath>
+            <w:r>
+              <w:rPr>
+                <w:rFonts w:ascii="Helvetica" w:eastAsiaTheme="minorEastAsia" w:hAnsi="Helvetica" w:cs="Helvetica"/>
+                <w:sz w:val="20"/>
+                <w:szCs w:val="20"/>
+              </w:rPr>
+              <w:t>)</w:t>
+            </w:r>
+          </w:p>
+        </w:tc>
+        <w:tc>
+          <w:tcPr>
+            <w:tcW w:w="0" w:type="auto"/>
+          </w:tcPr>
+          <w:p>
+            <w:pPr>
+              <w:rPr>
+                <w:rFonts w:ascii="Helvetica" w:hAnsi="Helvetica" w:cs="Helvetica"/>
+                <w:sz w:val="20"/>
+                <w:szCs w:val="20"/>
+              </w:rPr>
+            </w:pPr>
+          </w:p>
+        </w:tc>
+        <w:tc>
+          <w:tcPr>
+            <w:tcW w:w="0" w:type="auto"/>
+          </w:tcPr>
+          <w:p>
+            <w:pPr>
+              <w:rPr>
+                <w:rFonts w:ascii="Helvetica" w:hAnsi="Helvetica" w:cs="Helvetica"/>
+                <w:sz w:val="20"/>
+                <w:szCs w:val="20"/>
+              </w:rPr>
+            </w:pPr>
+          </w:p>
+        </w:tc>
+        <w:tc>
+          <w:tcPr>
+            <w:tcW w:w="0" w:type="auto"/>
           </w:tcPr>
           <w:p>
             <w:pPr>
@@ -1527,7 +1335,7 @@
         </w:tc>
         <w:tc>
           <w:tcPr>
-            <w:tcW w:w="1349" w:type="dxa"/>
+            <w:tcW w:w="1547" w:type="dxa"/>
           </w:tcPr>
           <w:p>
             <w:pPr>
@@ -1545,542 +1353,6 @@
               </w:rPr>
               <w:t>Low</w:t>
             </w:r>
-          </w:p>
-        </w:tc>
-        <w:tc>
-          <w:tcPr>
-            <w:tcW w:w="1675" w:type="dxa"/>
-          </w:tcPr>
-          <w:p>
-            <w:pPr>
-              <w:rPr>
-                <w:rFonts w:ascii="Helvetica" w:hAnsi="Helvetica" w:cs="Helvetica"/>
-                <w:sz w:val="20"/>
-                <w:szCs w:val="20"/>
-              </w:rPr>
-            </w:pPr>
-            <w:r>
-              <w:rPr>
-                <w:rFonts w:ascii="Helvetica" w:hAnsi="Helvetica" w:cs="Helvetica"/>
-                <w:sz w:val="20"/>
-                <w:szCs w:val="20"/>
-              </w:rPr>
-              <w:t>α=0.5</w:t>
-            </w:r>
-          </w:p>
-        </w:tc>
-      </w:tr>
-      <w:tr>
-        <w:tc>
-          <w:tcPr>
-            <w:tcW w:w="1255" w:type="dxa"/>
-          </w:tcPr>
-          <w:p>
-            <w:pPr>
-              <w:rPr>
-                <w:rFonts w:ascii="Helvetica" w:hAnsi="Helvetica" w:cs="Helvetica"/>
-                <w:sz w:val="20"/>
-                <w:szCs w:val="20"/>
-              </w:rPr>
-            </w:pPr>
-            <w:r>
-              <w:rPr>
-                <w:rFonts w:ascii="Helvetica" w:hAnsi="Helvetica" w:cs="Helvetica"/>
-                <w:sz w:val="20"/>
-                <w:szCs w:val="20"/>
-              </w:rPr>
-              <w:t>FHN</w:t>
-            </w:r>
-          </w:p>
-        </w:tc>
-        <w:tc>
-          <w:tcPr>
-            <w:tcW w:w="1282" w:type="dxa"/>
-          </w:tcPr>
-          <w:p>
-            <w:pPr>
-              <w:rPr>
-                <w:rFonts w:ascii="Helvetica" w:hAnsi="Helvetica" w:cs="Helvetica"/>
-                <w:sz w:val="20"/>
-                <w:szCs w:val="20"/>
-              </w:rPr>
-            </w:pPr>
-            <w:r>
-              <w:rPr>
-                <w:rFonts w:ascii="Helvetica" w:hAnsi="Helvetica" w:cs="Helvetica"/>
-                <w:sz w:val="20"/>
-                <w:szCs w:val="20"/>
-              </w:rPr>
-              <w:t>Yes</w:t>
-            </w:r>
-          </w:p>
-        </w:tc>
-        <w:tc>
-          <w:tcPr>
-            <w:tcW w:w="1461" w:type="dxa"/>
-          </w:tcPr>
-          <w:p>
-            <w:pPr>
-              <w:rPr>
-                <w:rFonts w:ascii="Helvetica" w:hAnsi="Helvetica" w:cs="Helvetica"/>
-                <w:sz w:val="20"/>
-                <w:szCs w:val="20"/>
-              </w:rPr>
-            </w:pPr>
-            <w:r>
-              <w:rPr>
-                <w:rFonts w:ascii="Helvetica" w:hAnsi="Helvetica" w:cs="Helvetica"/>
-                <w:sz w:val="20"/>
-                <w:szCs w:val="20"/>
-              </w:rPr>
-              <w:t>Degree-3 polynomials</w:t>
-            </w:r>
-            <w:r>
-              <w:rPr>
-                <w:rFonts w:ascii="Helvetica" w:hAnsi="Helvetica" w:cs="Helvetica"/>
-                <w:sz w:val="20"/>
-                <w:szCs w:val="20"/>
-              </w:rPr>
-              <w:t xml:space="preserve"> + </w:t>
-            </w:r>
-            <w:proofErr w:type="spellStart"/>
-            <w:r>
-              <w:rPr>
-                <w:rFonts w:ascii="Helvetica" w:hAnsi="Helvetica" w:cs="Helvetica"/>
-                <w:sz w:val="20"/>
-                <w:szCs w:val="20"/>
-              </w:rPr>
-              <w:t>FourierLibrary</w:t>
-            </w:r>
-            <w:proofErr w:type="spellEnd"/>
-          </w:p>
-        </w:tc>
-        <w:tc>
-          <w:tcPr>
-            <w:tcW w:w="1186" w:type="dxa"/>
-          </w:tcPr>
-          <w:p>
-            <w:pPr>
-              <w:rPr>
-                <w:rFonts w:ascii="Helvetica" w:hAnsi="Helvetica" w:cs="Helvetica"/>
-                <w:sz w:val="20"/>
-                <w:szCs w:val="20"/>
-              </w:rPr>
-            </w:pPr>
-            <w:r>
-              <w:rPr>
-                <w:rFonts w:ascii="Helvetica" w:hAnsi="Helvetica" w:cs="Helvetica"/>
-                <w:sz w:val="20"/>
-                <w:szCs w:val="20"/>
-              </w:rPr>
-              <w:t>SSR</w:t>
-            </w:r>
-          </w:p>
-        </w:tc>
-        <w:tc>
-          <w:tcPr>
-            <w:tcW w:w="1327" w:type="dxa"/>
-          </w:tcPr>
-          <w:p>
-            <w:pPr>
-              <w:rPr>
-                <w:rFonts w:ascii="Helvetica" w:hAnsi="Helvetica" w:cs="Helvetica"/>
-                <w:sz w:val="20"/>
-                <w:szCs w:val="20"/>
-              </w:rPr>
-            </w:pPr>
-            <w:r>
-              <w:rPr>
-                <w:rFonts w:ascii="Helvetica" w:hAnsi="Helvetica" w:cs="Helvetica"/>
-                <w:sz w:val="20"/>
-                <w:szCs w:val="20"/>
-              </w:rPr>
-              <w:t>In-progress</w:t>
-            </w:r>
-          </w:p>
-        </w:tc>
-        <w:tc>
-          <w:tcPr>
-            <w:tcW w:w="1349" w:type="dxa"/>
-          </w:tcPr>
-          <w:p>
-            <w:pPr>
-              <w:rPr>
-                <w:rFonts w:ascii="Helvetica" w:hAnsi="Helvetica" w:cs="Helvetica"/>
-                <w:sz w:val="20"/>
-                <w:szCs w:val="20"/>
-              </w:rPr>
-            </w:pPr>
-            <w:r>
-              <w:rPr>
-                <w:rFonts w:ascii="Helvetica" w:hAnsi="Helvetica" w:cs="Helvetica"/>
-                <w:sz w:val="20"/>
-                <w:szCs w:val="20"/>
-              </w:rPr>
-              <w:t>In-progress</w:t>
-            </w:r>
-          </w:p>
-        </w:tc>
-        <w:tc>
-          <w:tcPr>
-            <w:tcW w:w="1675" w:type="dxa"/>
-          </w:tcPr>
-          <w:p>
-            <w:pPr>
-              <w:rPr>
-                <w:rFonts w:ascii="Helvetica" w:hAnsi="Helvetica" w:cs="Helvetica"/>
-                <w:sz w:val="20"/>
-                <w:szCs w:val="20"/>
-              </w:rPr>
-            </w:pPr>
-            <w:r>
-              <w:rPr>
-                <w:rFonts w:ascii="Helvetica" w:hAnsi="Helvetica" w:cs="Helvetica"/>
-                <w:sz w:val="20"/>
-                <w:szCs w:val="20"/>
-              </w:rPr>
-              <w:t>In-progress (</w:t>
-            </w:r>
-            <w:r>
-              <w:rPr>
-                <w:rFonts w:ascii="Helvetica" w:hAnsi="Helvetica" w:cs="Helvetica"/>
-                <w:sz w:val="20"/>
-                <w:szCs w:val="20"/>
-              </w:rPr>
-              <w:t>α=0.</w:t>
-            </w:r>
-            <w:r>
-              <w:rPr>
-                <w:rFonts w:ascii="Helvetica" w:hAnsi="Helvetica" w:cs="Helvetica"/>
-                <w:sz w:val="20"/>
-                <w:szCs w:val="20"/>
-              </w:rPr>
-              <w:t>00001 currently yielding fewest spurious terms)</w:t>
-            </w:r>
-          </w:p>
-        </w:tc>
-      </w:tr>
-      <w:tr>
-        <w:tc>
-          <w:tcPr>
-            <w:tcW w:w="1255" w:type="dxa"/>
-          </w:tcPr>
-          <w:p>
-            <w:pPr>
-              <w:rPr>
-                <w:rFonts w:ascii="Helvetica" w:hAnsi="Helvetica" w:cs="Helvetica"/>
-                <w:sz w:val="20"/>
-                <w:szCs w:val="20"/>
-              </w:rPr>
-            </w:pPr>
-            <w:r>
-              <w:rPr>
-                <w:rFonts w:ascii="Helvetica" w:hAnsi="Helvetica" w:cs="Helvetica"/>
-                <w:sz w:val="20"/>
-                <w:szCs w:val="20"/>
-              </w:rPr>
-              <w:t>FHN-c</w:t>
-            </w:r>
-          </w:p>
-        </w:tc>
-        <w:tc>
-          <w:tcPr>
-            <w:tcW w:w="1282" w:type="dxa"/>
-          </w:tcPr>
-          <w:p>
-            <w:pPr>
-              <w:rPr>
-                <w:rFonts w:ascii="Helvetica" w:hAnsi="Helvetica" w:cs="Helvetica"/>
-                <w:sz w:val="20"/>
-                <w:szCs w:val="20"/>
-              </w:rPr>
-            </w:pPr>
-          </w:p>
-        </w:tc>
-        <w:tc>
-          <w:tcPr>
-            <w:tcW w:w="1461" w:type="dxa"/>
-          </w:tcPr>
-          <w:p>
-            <w:pPr>
-              <w:rPr>
-                <w:rFonts w:ascii="Helvetica" w:hAnsi="Helvetica" w:cs="Helvetica"/>
-                <w:sz w:val="20"/>
-                <w:szCs w:val="20"/>
-              </w:rPr>
-            </w:pPr>
-          </w:p>
-        </w:tc>
-        <w:tc>
-          <w:tcPr>
-            <w:tcW w:w="1186" w:type="dxa"/>
-          </w:tcPr>
-          <w:p>
-            <w:pPr>
-              <w:rPr>
-                <w:rFonts w:ascii="Helvetica" w:hAnsi="Helvetica" w:cs="Helvetica"/>
-                <w:sz w:val="20"/>
-                <w:szCs w:val="20"/>
-              </w:rPr>
-            </w:pPr>
-          </w:p>
-        </w:tc>
-        <w:tc>
-          <w:tcPr>
-            <w:tcW w:w="1327" w:type="dxa"/>
-          </w:tcPr>
-          <w:p>
-            <w:pPr>
-              <w:rPr>
-                <w:rFonts w:ascii="Helvetica" w:hAnsi="Helvetica" w:cs="Helvetica"/>
-                <w:sz w:val="20"/>
-                <w:szCs w:val="20"/>
-              </w:rPr>
-            </w:pPr>
-          </w:p>
-        </w:tc>
-        <w:tc>
-          <w:tcPr>
-            <w:tcW w:w="1349" w:type="dxa"/>
-          </w:tcPr>
-          <w:p>
-            <w:pPr>
-              <w:rPr>
-                <w:rFonts w:ascii="Helvetica" w:hAnsi="Helvetica" w:cs="Helvetica"/>
-                <w:sz w:val="20"/>
-                <w:szCs w:val="20"/>
-              </w:rPr>
-            </w:pPr>
-          </w:p>
-        </w:tc>
-        <w:tc>
-          <w:tcPr>
-            <w:tcW w:w="1675" w:type="dxa"/>
-          </w:tcPr>
-          <w:p>
-            <w:pPr>
-              <w:rPr>
-                <w:rFonts w:ascii="Helvetica" w:hAnsi="Helvetica" w:cs="Helvetica"/>
-                <w:sz w:val="20"/>
-                <w:szCs w:val="20"/>
-              </w:rPr>
-            </w:pPr>
-          </w:p>
-        </w:tc>
-      </w:tr>
-      <w:tr>
-        <w:tc>
-          <w:tcPr>
-            <w:tcW w:w="1255" w:type="dxa"/>
-          </w:tcPr>
-          <w:p>
-            <w:pPr>
-              <w:rPr>
-                <w:rFonts w:ascii="Helvetica" w:hAnsi="Helvetica" w:cs="Helvetica"/>
-                <w:sz w:val="20"/>
-                <w:szCs w:val="20"/>
-              </w:rPr>
-            </w:pPr>
-            <w:r>
-              <w:rPr>
-                <w:rFonts w:ascii="Helvetica" w:hAnsi="Helvetica" w:cs="Helvetica"/>
-                <w:sz w:val="20"/>
-                <w:szCs w:val="20"/>
-              </w:rPr>
-              <w:t>VF-FHN-a</w:t>
-            </w:r>
-          </w:p>
-        </w:tc>
-        <w:tc>
-          <w:tcPr>
-            <w:tcW w:w="1282" w:type="dxa"/>
-          </w:tcPr>
-          <w:p>
-            <w:pPr>
-              <w:rPr>
-                <w:rFonts w:ascii="Helvetica" w:hAnsi="Helvetica" w:cs="Helvetica"/>
-                <w:sz w:val="20"/>
-                <w:szCs w:val="20"/>
-              </w:rPr>
-            </w:pPr>
-          </w:p>
-        </w:tc>
-        <w:tc>
-          <w:tcPr>
-            <w:tcW w:w="1461" w:type="dxa"/>
-          </w:tcPr>
-          <w:p>
-            <w:pPr>
-              <w:rPr>
-                <w:rFonts w:ascii="Helvetica" w:hAnsi="Helvetica" w:cs="Helvetica"/>
-                <w:sz w:val="20"/>
-                <w:szCs w:val="20"/>
-              </w:rPr>
-            </w:pPr>
-          </w:p>
-        </w:tc>
-        <w:tc>
-          <w:tcPr>
-            <w:tcW w:w="1186" w:type="dxa"/>
-          </w:tcPr>
-          <w:p>
-            <w:pPr>
-              <w:rPr>
-                <w:rFonts w:ascii="Helvetica" w:hAnsi="Helvetica" w:cs="Helvetica"/>
-                <w:sz w:val="20"/>
-                <w:szCs w:val="20"/>
-              </w:rPr>
-            </w:pPr>
-          </w:p>
-        </w:tc>
-        <w:tc>
-          <w:tcPr>
-            <w:tcW w:w="1327" w:type="dxa"/>
-          </w:tcPr>
-          <w:p>
-            <w:pPr>
-              <w:rPr>
-                <w:rFonts w:ascii="Helvetica" w:hAnsi="Helvetica" w:cs="Helvetica"/>
-                <w:sz w:val="20"/>
-                <w:szCs w:val="20"/>
-              </w:rPr>
-            </w:pPr>
-          </w:p>
-        </w:tc>
-        <w:tc>
-          <w:tcPr>
-            <w:tcW w:w="1349" w:type="dxa"/>
-          </w:tcPr>
-          <w:p>
-            <w:pPr>
-              <w:rPr>
-                <w:rFonts w:ascii="Helvetica" w:hAnsi="Helvetica" w:cs="Helvetica"/>
-                <w:sz w:val="20"/>
-                <w:szCs w:val="20"/>
-              </w:rPr>
-            </w:pPr>
-          </w:p>
-        </w:tc>
-        <w:tc>
-          <w:tcPr>
-            <w:tcW w:w="1675" w:type="dxa"/>
-          </w:tcPr>
-          <w:p>
-            <w:pPr>
-              <w:rPr>
-                <w:rFonts w:ascii="Helvetica" w:hAnsi="Helvetica" w:cs="Helvetica"/>
-                <w:sz w:val="20"/>
-                <w:szCs w:val="20"/>
-              </w:rPr>
-            </w:pPr>
-          </w:p>
-        </w:tc>
-      </w:tr>
-      <w:tr>
-        <w:tc>
-          <w:tcPr>
-            <w:tcW w:w="1255" w:type="dxa"/>
-          </w:tcPr>
-          <w:p>
-            <w:pPr>
-              <w:rPr>
-                <w:rFonts w:ascii="Helvetica" w:hAnsi="Helvetica" w:cs="Helvetica"/>
-                <w:sz w:val="20"/>
-                <w:szCs w:val="20"/>
-              </w:rPr>
-            </w:pPr>
-            <w:r>
-              <w:rPr>
-                <w:rFonts w:ascii="Helvetica" w:hAnsi="Helvetica" w:cs="Helvetica"/>
-                <w:sz w:val="20"/>
-                <w:szCs w:val="20"/>
-              </w:rPr>
-              <w:t>VF-FHN-b</w:t>
-            </w:r>
-          </w:p>
-        </w:tc>
-        <w:tc>
-          <w:tcPr>
-            <w:tcW w:w="1282" w:type="dxa"/>
-          </w:tcPr>
-          <w:p>
-            <w:pPr>
-              <w:rPr>
-                <w:rFonts w:ascii="Helvetica" w:hAnsi="Helvetica" w:cs="Helvetica"/>
-                <w:sz w:val="20"/>
-                <w:szCs w:val="20"/>
-              </w:rPr>
-            </w:pPr>
-          </w:p>
-        </w:tc>
-        <w:tc>
-          <w:tcPr>
-            <w:tcW w:w="1461" w:type="dxa"/>
-          </w:tcPr>
-          <w:p>
-            <w:pPr>
-              <w:rPr>
-                <w:rFonts w:ascii="Helvetica" w:hAnsi="Helvetica" w:cs="Helvetica"/>
-                <w:sz w:val="20"/>
-                <w:szCs w:val="20"/>
-              </w:rPr>
-            </w:pPr>
-          </w:p>
-        </w:tc>
-        <w:tc>
-          <w:tcPr>
-            <w:tcW w:w="1186" w:type="dxa"/>
-          </w:tcPr>
-          <w:p>
-            <w:pPr>
-              <w:rPr>
-                <w:rFonts w:ascii="Helvetica" w:hAnsi="Helvetica" w:cs="Helvetica"/>
-                <w:sz w:val="20"/>
-                <w:szCs w:val="20"/>
-              </w:rPr>
-            </w:pPr>
-          </w:p>
-        </w:tc>
-        <w:tc>
-          <w:tcPr>
-            <w:tcW w:w="1327" w:type="dxa"/>
-          </w:tcPr>
-          <w:p>
-            <w:pPr>
-              <w:rPr>
-                <w:rFonts w:ascii="Helvetica" w:hAnsi="Helvetica" w:cs="Helvetica"/>
-                <w:sz w:val="20"/>
-                <w:szCs w:val="20"/>
-              </w:rPr>
-            </w:pPr>
-          </w:p>
-        </w:tc>
-        <w:tc>
-          <w:tcPr>
-            <w:tcW w:w="1349" w:type="dxa"/>
-          </w:tcPr>
-          <w:p>
-            <w:pPr>
-              <w:rPr>
-                <w:rFonts w:ascii="Helvetica" w:hAnsi="Helvetica" w:cs="Helvetica"/>
-                <w:sz w:val="20"/>
-                <w:szCs w:val="20"/>
-              </w:rPr>
-            </w:pPr>
-          </w:p>
-        </w:tc>
-        <w:tc>
-          <w:tcPr>
-            <w:tcW w:w="1675" w:type="dxa"/>
-          </w:tcPr>
-          <w:p>
-            <w:pPr>
-              <w:rPr>
-                <w:rFonts w:ascii="Helvetica" w:hAnsi="Helvetica" w:cs="Helvetica"/>
-                <w:sz w:val="20"/>
-                <w:szCs w:val="20"/>
-              </w:rPr>
-            </w:pPr>
           </w:p>
         </w:tc>
       </w:tr>
@@ -3040,6 +2312,16 @@
       </w:tblBorders>
     </w:tblPr>
   </w:style>
+  <w:style w:type="character" w:styleId="PlaceholderText">
+    <w:name w:val="Placeholder Text"/>
+    <w:basedOn w:val="DefaultParagraphFont"/>
+    <w:uiPriority w:val="99"/>
+    <w:semiHidden/>
+    <w:rsid w:val="000A02D2"/>
+    <w:rPr>
+      <w:color w:val="666666"/>
+    </w:rPr>
+  </w:style>
 </w:styles>
 </file>
 

</xml_diff>

<commit_message>
Final table formatting edits.
</commit_message>
<xml_diff>
--- a/SINDy ID Results Table.docx
+++ b/SINDy ID Results Table.docx
@@ -14,7 +14,7 @@
         <w:tblLook w:val="04A0" w:firstRow="1" w:lastRow="0" w:firstColumn="1" w:lastColumn="0" w:noHBand="0" w:noVBand="1"/>
       </w:tblPr>
       <w:tblGrid>
-        <w:gridCol w:w="1128"/>
+        <w:gridCol w:w="950"/>
         <w:gridCol w:w="1673"/>
         <w:gridCol w:w="1139"/>
         <w:gridCol w:w="1528"/>
@@ -153,26 +153,6 @@
               </w:rPr>
               <w:t>Threshold Sensitivity</w:t>
             </w:r>
-            <w:r>
-              <w:rPr>
-                <w:rFonts w:ascii="Helvetica" w:hAnsi="Helvetica" w:cs="Helvetica"/>
-                <w:b/>
-                <w:bCs/>
-                <w:sz w:val="20"/>
-                <w:szCs w:val="20"/>
-              </w:rPr>
-              <w:t xml:space="preserve"> </w:t>
-            </w:r>
-            <w:r>
-              <w:rPr>
-                <w:rFonts w:ascii="Helvetica" w:hAnsi="Helvetica" w:cs="Helvetica"/>
-                <w:b/>
-                <w:bCs/>
-                <w:sz w:val="20"/>
-                <w:szCs w:val="20"/>
-              </w:rPr>
-              <w:t>(If Applicable)</w:t>
-            </w:r>
           </w:p>
         </w:tc>
       </w:tr>
@@ -201,49 +181,6 @@
               </w:rPr>
               <w:t>FHN</w:t>
             </w:r>
-            <w:r>
-              <w:rPr>
-                <w:rFonts w:ascii="Helvetica" w:hAnsi="Helvetica" w:cs="Helvetica"/>
-                <w:sz w:val="20"/>
-                <w:szCs w:val="20"/>
-              </w:rPr>
-              <w:t xml:space="preserve"> </w:t>
-            </w:r>
-          </w:p>
-          <w:p>
-            <w:pPr>
-              <w:rPr>
-                <w:rFonts w:ascii="Helvetica" w:hAnsi="Helvetica" w:cs="Helvetica"/>
-                <w:sz w:val="20"/>
-                <w:szCs w:val="20"/>
-              </w:rPr>
-            </w:pPr>
-            <w:r>
-              <w:rPr>
-                <w:rFonts w:ascii="Helvetica" w:hAnsi="Helvetica" w:cs="Helvetica"/>
-                <w:sz w:val="20"/>
-                <w:szCs w:val="20"/>
-              </w:rPr>
-              <w:t>(</w:t>
-            </w:r>
-            <m:oMath>
-              <m:r>
-                <w:rPr>
-                  <w:rFonts w:ascii="Cambria Math" w:hAnsi="Cambria Math" w:cs="Helvetica"/>
-                  <w:sz w:val="20"/>
-                  <w:szCs w:val="20"/>
-                </w:rPr>
-                <m:t>ϵ=0.01</m:t>
-              </m:r>
-            </m:oMath>
-            <w:r>
-              <w:rPr>
-                <w:rFonts w:ascii="Helvetica" w:eastAsiaTheme="minorEastAsia" w:hAnsi="Helvetica" w:cs="Helvetica"/>
-                <w:sz w:val="20"/>
-                <w:szCs w:val="20"/>
-              </w:rPr>
-              <w:t>)</w:t>
-            </w:r>
           </w:p>
         </w:tc>
         <w:tc>
@@ -366,6 +303,14 @@
                 <w:szCs w:val="20"/>
               </w:rPr>
             </w:pPr>
+            <w:r>
+              <w:rPr>
+                <w:rFonts w:ascii="Helvetica" w:hAnsi="Helvetica" w:cs="Helvetica"/>
+                <w:sz w:val="20"/>
+                <w:szCs w:val="20"/>
+              </w:rPr>
+              <w:t>Poly3</w:t>
+            </w:r>
           </w:p>
         </w:tc>
         <w:tc>
@@ -466,6 +411,14 @@
                 <w:szCs w:val="20"/>
               </w:rPr>
             </w:pPr>
+            <w:r>
+              <w:rPr>
+                <w:rFonts w:ascii="Helvetica" w:hAnsi="Helvetica" w:cs="Helvetica"/>
+                <w:sz w:val="20"/>
+                <w:szCs w:val="20"/>
+              </w:rPr>
+              <w:t>Poly3</w:t>
+            </w:r>
           </w:p>
         </w:tc>
         <w:tc>
@@ -588,6 +541,14 @@
                 <w:szCs w:val="20"/>
               </w:rPr>
             </w:pPr>
+            <w:r>
+              <w:rPr>
+                <w:rFonts w:ascii="Helvetica" w:hAnsi="Helvetica" w:cs="Helvetica"/>
+                <w:sz w:val="20"/>
+                <w:szCs w:val="20"/>
+              </w:rPr>
+              <w:t>SSR</w:t>
+            </w:r>
           </w:p>
         </w:tc>
         <w:tc>
@@ -624,6 +585,14 @@
                 <w:szCs w:val="20"/>
               </w:rPr>
             </w:pPr>
+            <w:r>
+              <w:rPr>
+                <w:rFonts w:ascii="Helvetica" w:hAnsi="Helvetica" w:cs="Helvetica"/>
+                <w:sz w:val="20"/>
+                <w:szCs w:val="20"/>
+              </w:rPr>
+              <w:t>N/A</w:t>
+            </w:r>
           </w:p>
         </w:tc>
       </w:tr>
@@ -652,49 +621,6 @@
               </w:rPr>
               <w:t>FHN-c</w:t>
             </w:r>
-            <w:r>
-              <w:rPr>
-                <w:rFonts w:ascii="Helvetica" w:hAnsi="Helvetica" w:cs="Helvetica"/>
-                <w:sz w:val="20"/>
-                <w:szCs w:val="20"/>
-              </w:rPr>
-              <w:t xml:space="preserve"> </w:t>
-            </w:r>
-          </w:p>
-          <w:p>
-            <w:pPr>
-              <w:rPr>
-                <w:rFonts w:ascii="Helvetica" w:hAnsi="Helvetica" w:cs="Helvetica"/>
-                <w:sz w:val="20"/>
-                <w:szCs w:val="20"/>
-              </w:rPr>
-            </w:pPr>
-            <w:r>
-              <w:rPr>
-                <w:rFonts w:ascii="Helvetica" w:hAnsi="Helvetica" w:cs="Helvetica"/>
-                <w:sz w:val="20"/>
-                <w:szCs w:val="20"/>
-              </w:rPr>
-              <w:t>(</w:t>
-            </w:r>
-            <m:oMath>
-              <m:r>
-                <w:rPr>
-                  <w:rFonts w:ascii="Cambria Math" w:hAnsi="Cambria Math" w:cs="Helvetica"/>
-                  <w:sz w:val="20"/>
-                  <w:szCs w:val="20"/>
-                </w:rPr>
-                <m:t>ϵ=0.01</m:t>
-              </m:r>
-            </m:oMath>
-            <w:r>
-              <w:rPr>
-                <w:rFonts w:ascii="Helvetica" w:eastAsiaTheme="minorEastAsia" w:hAnsi="Helvetica" w:cs="Helvetica"/>
-                <w:sz w:val="20"/>
-                <w:szCs w:val="20"/>
-              </w:rPr>
-              <w:t>)</w:t>
-            </w:r>
           </w:p>
         </w:tc>
         <w:tc>
@@ -775,6 +701,14 @@
                 <w:szCs w:val="20"/>
               </w:rPr>
             </w:pPr>
+            <w:r>
+              <w:rPr>
+                <w:rFonts w:ascii="Helvetica" w:hAnsi="Helvetica" w:cs="Helvetica"/>
+                <w:sz w:val="20"/>
+                <w:szCs w:val="20"/>
+              </w:rPr>
+              <w:t>N/A</w:t>
+            </w:r>
           </w:p>
         </w:tc>
       </w:tr>
@@ -809,6 +743,14 @@
                 <w:szCs w:val="20"/>
               </w:rPr>
             </w:pPr>
+            <w:r>
+              <w:rPr>
+                <w:rFonts w:ascii="Helvetica" w:hAnsi="Helvetica" w:cs="Helvetica"/>
+                <w:sz w:val="20"/>
+                <w:szCs w:val="20"/>
+              </w:rPr>
+              <w:t>Poly3</w:t>
+            </w:r>
           </w:p>
         </w:tc>
         <w:tc>
@@ -867,6 +809,14 @@
                 <w:szCs w:val="20"/>
               </w:rPr>
             </w:pPr>
+            <w:r>
+              <w:rPr>
+                <w:rFonts w:ascii="Helvetica" w:hAnsi="Helvetica" w:cs="Helvetica"/>
+                <w:sz w:val="20"/>
+                <w:szCs w:val="20"/>
+              </w:rPr>
+              <w:t>N/A</w:t>
+            </w:r>
           </w:p>
         </w:tc>
       </w:tr>
@@ -901,6 +851,14 @@
                 <w:szCs w:val="20"/>
               </w:rPr>
             </w:pPr>
+            <w:r>
+              <w:rPr>
+                <w:rFonts w:ascii="Helvetica" w:hAnsi="Helvetica" w:cs="Helvetica"/>
+                <w:sz w:val="20"/>
+                <w:szCs w:val="20"/>
+              </w:rPr>
+              <w:t>Poly3</w:t>
+            </w:r>
           </w:p>
         </w:tc>
         <w:tc>
@@ -1023,6 +981,14 @@
                 <w:szCs w:val="20"/>
               </w:rPr>
             </w:pPr>
+            <w:r>
+              <w:rPr>
+                <w:rFonts w:ascii="Helvetica" w:hAnsi="Helvetica" w:cs="Helvetica"/>
+                <w:sz w:val="20"/>
+                <w:szCs w:val="20"/>
+              </w:rPr>
+              <w:t>SSR</w:t>
+            </w:r>
           </w:p>
         </w:tc>
         <w:tc>
@@ -1059,6 +1025,14 @@
                 <w:szCs w:val="20"/>
               </w:rPr>
             </w:pPr>
+            <w:r>
+              <w:rPr>
+                <w:rFonts w:ascii="Helvetica" w:hAnsi="Helvetica" w:cs="Helvetica"/>
+                <w:sz w:val="20"/>
+                <w:szCs w:val="20"/>
+              </w:rPr>
+              <w:t>N/A</w:t>
+            </w:r>
           </w:p>
         </w:tc>
       </w:tr>
@@ -1085,50 +1059,7 @@
                 <w:sz w:val="20"/>
                 <w:szCs w:val="20"/>
               </w:rPr>
-              <w:t>VF-FHN-a</w:t>
-            </w:r>
-            <w:r>
-              <w:rPr>
-                <w:rFonts w:ascii="Helvetica" w:hAnsi="Helvetica" w:cs="Helvetica"/>
-                <w:sz w:val="20"/>
-                <w:szCs w:val="20"/>
-              </w:rPr>
-              <w:t xml:space="preserve"> </w:t>
-            </w:r>
-          </w:p>
-          <w:p>
-            <w:pPr>
-              <w:rPr>
-                <w:rFonts w:ascii="Helvetica" w:hAnsi="Helvetica" w:cs="Helvetica"/>
-                <w:sz w:val="20"/>
-                <w:szCs w:val="20"/>
-              </w:rPr>
-            </w:pPr>
-            <w:r>
-              <w:rPr>
-                <w:rFonts w:ascii="Helvetica" w:hAnsi="Helvetica" w:cs="Helvetica"/>
-                <w:sz w:val="20"/>
-                <w:szCs w:val="20"/>
-              </w:rPr>
-              <w:t>(</w:t>
-            </w:r>
-            <m:oMath>
-              <m:r>
-                <w:rPr>
-                  <w:rFonts w:ascii="Cambria Math" w:hAnsi="Cambria Math" w:cs="Helvetica"/>
-                  <w:sz w:val="20"/>
-                  <w:szCs w:val="20"/>
-                </w:rPr>
-                <m:t>ϵ=0.01</m:t>
-              </m:r>
-            </m:oMath>
-            <w:r>
-              <w:rPr>
-                <w:rFonts w:ascii="Helvetica" w:eastAsiaTheme="minorEastAsia" w:hAnsi="Helvetica" w:cs="Helvetica"/>
-                <w:sz w:val="20"/>
-                <w:szCs w:val="20"/>
-              </w:rPr>
-              <w:t>)</w:t>
+              <w:t>VF-FHN</w:t>
             </w:r>
           </w:p>
         </w:tc>
@@ -1166,149 +1097,14 @@
                 <w:szCs w:val="20"/>
               </w:rPr>
             </w:pPr>
-          </w:p>
-        </w:tc>
-        <w:tc>
-          <w:tcPr>
-            <w:tcW w:w="0" w:type="auto"/>
-          </w:tcPr>
-          <w:p>
-            <w:pPr>
-              <w:rPr>
-                <w:rFonts w:ascii="Helvetica" w:hAnsi="Helvetica" w:cs="Helvetica"/>
-                <w:sz w:val="20"/>
-                <w:szCs w:val="20"/>
-              </w:rPr>
-            </w:pPr>
-            <w:r>
-              <w:rPr>
-                <w:rFonts w:ascii="Helvetica" w:hAnsi="Helvetica" w:cs="Helvetica"/>
-                <w:sz w:val="20"/>
-                <w:szCs w:val="20"/>
-              </w:rPr>
-              <w:t>Yes</w:t>
-            </w:r>
-          </w:p>
-        </w:tc>
-        <w:tc>
-          <w:tcPr>
-            <w:tcW w:w="1547" w:type="dxa"/>
-          </w:tcPr>
-          <w:p>
-            <w:pPr>
-              <w:rPr>
-                <w:rFonts w:ascii="Helvetica" w:hAnsi="Helvetica" w:cs="Helvetica"/>
-                <w:sz w:val="20"/>
-                <w:szCs w:val="20"/>
-              </w:rPr>
-            </w:pPr>
-            <w:r>
-              <w:rPr>
-                <w:rFonts w:ascii="Helvetica" w:hAnsi="Helvetica" w:cs="Helvetica"/>
-                <w:sz w:val="20"/>
-                <w:szCs w:val="20"/>
-              </w:rPr>
-              <w:t>Low</w:t>
-            </w:r>
-          </w:p>
-        </w:tc>
-      </w:tr>
-      <w:tr>
-        <w:trPr>
-          <w:trHeight w:val="465"/>
-          <w:jc w:val="center"/>
-        </w:trPr>
-        <w:tc>
-          <w:tcPr>
-            <w:tcW w:w="0" w:type="auto"/>
-          </w:tcPr>
-          <w:p>
-            <w:pPr>
-              <w:rPr>
-                <w:rFonts w:ascii="Helvetica" w:hAnsi="Helvetica" w:cs="Helvetica"/>
-                <w:sz w:val="20"/>
-                <w:szCs w:val="20"/>
-              </w:rPr>
-            </w:pPr>
-            <w:r>
-              <w:rPr>
-                <w:rFonts w:ascii="Helvetica" w:hAnsi="Helvetica" w:cs="Helvetica"/>
-                <w:sz w:val="20"/>
-                <w:szCs w:val="20"/>
-              </w:rPr>
-              <w:t>VF-FHN-b</w:t>
-            </w:r>
-            <w:r>
-              <w:rPr>
-                <w:rFonts w:ascii="Helvetica" w:hAnsi="Helvetica" w:cs="Helvetica"/>
-                <w:sz w:val="20"/>
-                <w:szCs w:val="20"/>
-              </w:rPr>
-              <w:t xml:space="preserve"> </w:t>
-            </w:r>
-          </w:p>
-          <w:p>
-            <w:pPr>
-              <w:rPr>
-                <w:rFonts w:ascii="Helvetica" w:hAnsi="Helvetica" w:cs="Helvetica"/>
-                <w:sz w:val="20"/>
-                <w:szCs w:val="20"/>
-              </w:rPr>
-            </w:pPr>
-            <w:r>
-              <w:rPr>
-                <w:rFonts w:ascii="Helvetica" w:hAnsi="Helvetica" w:cs="Helvetica"/>
-                <w:sz w:val="20"/>
-                <w:szCs w:val="20"/>
-              </w:rPr>
-              <w:t>(</w:t>
-            </w:r>
-            <m:oMath>
-              <m:r>
-                <w:rPr>
-                  <w:rFonts w:ascii="Cambria Math" w:hAnsi="Cambria Math" w:cs="Helvetica"/>
-                  <w:sz w:val="20"/>
-                  <w:szCs w:val="20"/>
-                </w:rPr>
-                <m:t>ϵ=0.01</m:t>
-              </m:r>
-            </m:oMath>
-            <w:r>
-              <w:rPr>
-                <w:rFonts w:ascii="Helvetica" w:eastAsiaTheme="minorEastAsia" w:hAnsi="Helvetica" w:cs="Helvetica"/>
-                <w:sz w:val="20"/>
-                <w:szCs w:val="20"/>
-              </w:rPr>
-              <w:t>)</w:t>
-            </w:r>
-          </w:p>
-        </w:tc>
-        <w:tc>
-          <w:tcPr>
-            <w:tcW w:w="0" w:type="auto"/>
-          </w:tcPr>
-          <w:p>
-            <w:pPr>
-              <w:rPr>
-                <w:rFonts w:ascii="Helvetica" w:hAnsi="Helvetica" w:cs="Helvetica"/>
-                <w:sz w:val="20"/>
-                <w:szCs w:val="20"/>
-              </w:rPr>
-            </w:pPr>
-          </w:p>
-        </w:tc>
-        <w:tc>
-          <w:tcPr>
-            <w:tcW w:w="0" w:type="auto"/>
-          </w:tcPr>
-          <w:p>
-            <w:pPr>
-              <w:rPr>
-                <w:rFonts w:ascii="Helvetica" w:hAnsi="Helvetica" w:cs="Helvetica"/>
-                <w:sz w:val="20"/>
-                <w:szCs w:val="20"/>
-              </w:rPr>
-            </w:pPr>
+            <w:r>
+              <w:rPr>
+                <w:rFonts w:ascii="Helvetica" w:hAnsi="Helvetica" w:cs="Helvetica"/>
+                <w:sz w:val="20"/>
+                <w:szCs w:val="20"/>
+              </w:rPr>
+              <w:t>SSR</w:t>
+            </w:r>
           </w:p>
         </w:tc>
         <w:tc>

</xml_diff>

<commit_message>
Updated SINDy results table from newer runs and added DPI controls to some plots.
</commit_message>
<xml_diff>
--- a/SINDy ID Results Table.docx
+++ b/SINDy ID Results Table.docx
@@ -14,7 +14,7 @@
         <w:tblLook w:val="04A0" w:firstRow="1" w:lastRow="0" w:firstColumn="1" w:lastColumn="0" w:noHBand="0" w:noVBand="1"/>
       </w:tblPr>
       <w:tblGrid>
-        <w:gridCol w:w="950"/>
+        <w:gridCol w:w="794"/>
         <w:gridCol w:w="1673"/>
         <w:gridCol w:w="1139"/>
         <w:gridCol w:w="1528"/>
@@ -151,7 +151,17 @@
                 <w:sz w:val="20"/>
                 <w:szCs w:val="20"/>
               </w:rPr>
-              <w:t>Threshold Sensitivity</w:t>
+              <w:t>Threshold/ Parameter</w:t>
+            </w:r>
+            <w:r>
+              <w:rPr>
+                <w:rFonts w:ascii="Helvetica" w:hAnsi="Helvetica" w:cs="Helvetica"/>
+                <w:b/>
+                <w:bCs/>
+                <w:sz w:val="20"/>
+                <w:szCs w:val="20"/>
+              </w:rPr>
+              <w:t xml:space="preserve"> Sensitivity</w:t>
             </w:r>
           </w:p>
         </w:tc>
@@ -1059,7 +1069,131 @@
                 <w:sz w:val="20"/>
                 <w:szCs w:val="20"/>
               </w:rPr>
-              <w:t>VF-FHN</w:t>
+              <w:t>VF-</w:t>
+            </w:r>
+            <w:r>
+              <w:rPr>
+                <w:rFonts w:ascii="Helvetica" w:hAnsi="Helvetica" w:cs="Helvetica"/>
+                <w:sz w:val="20"/>
+                <w:szCs w:val="20"/>
+              </w:rPr>
+              <w:t>4</w:t>
+            </w:r>
+          </w:p>
+        </w:tc>
+        <w:tc>
+          <w:tcPr>
+            <w:tcW w:w="0" w:type="auto"/>
+          </w:tcPr>
+          <w:p>
+            <w:pPr>
+              <w:rPr>
+                <w:rFonts w:ascii="Helvetica" w:hAnsi="Helvetica" w:cs="Helvetica"/>
+                <w:sz w:val="20"/>
+                <w:szCs w:val="20"/>
+              </w:rPr>
+            </w:pPr>
+            <w:r>
+              <w:rPr>
+                <w:rFonts w:ascii="Helvetica" w:hAnsi="Helvetica" w:cs="Helvetica"/>
+                <w:sz w:val="20"/>
+                <w:szCs w:val="20"/>
+              </w:rPr>
+              <w:t>Poly3</w:t>
+            </w:r>
+          </w:p>
+        </w:tc>
+        <w:tc>
+          <w:tcPr>
+            <w:tcW w:w="0" w:type="auto"/>
+          </w:tcPr>
+          <w:p>
+            <w:pPr>
+              <w:rPr>
+                <w:rFonts w:ascii="Helvetica" w:hAnsi="Helvetica" w:cs="Helvetica"/>
+                <w:sz w:val="20"/>
+                <w:szCs w:val="20"/>
+              </w:rPr>
+            </w:pPr>
+            <w:r>
+              <w:rPr>
+                <w:rFonts w:ascii="Helvetica" w:hAnsi="Helvetica" w:cs="Helvetica"/>
+                <w:sz w:val="20"/>
+                <w:szCs w:val="20"/>
+              </w:rPr>
+              <w:t>SSR</w:t>
+            </w:r>
+          </w:p>
+        </w:tc>
+        <w:tc>
+          <w:tcPr>
+            <w:tcW w:w="0" w:type="auto"/>
+          </w:tcPr>
+          <w:p>
+            <w:pPr>
+              <w:rPr>
+                <w:rFonts w:ascii="Helvetica" w:hAnsi="Helvetica" w:cs="Helvetica"/>
+                <w:sz w:val="20"/>
+                <w:szCs w:val="20"/>
+              </w:rPr>
+            </w:pPr>
+            <w:r>
+              <w:rPr>
+                <w:rFonts w:ascii="Helvetica" w:hAnsi="Helvetica" w:cs="Helvetica"/>
+                <w:sz w:val="20"/>
+                <w:szCs w:val="20"/>
+              </w:rPr>
+              <w:t>Yes</w:t>
+            </w:r>
+          </w:p>
+        </w:tc>
+        <w:tc>
+          <w:tcPr>
+            <w:tcW w:w="1547" w:type="dxa"/>
+          </w:tcPr>
+          <w:p>
+            <w:pPr>
+              <w:rPr>
+                <w:rFonts w:ascii="Helvetica" w:hAnsi="Helvetica" w:cs="Helvetica"/>
+                <w:sz w:val="20"/>
+                <w:szCs w:val="20"/>
+              </w:rPr>
+            </w:pPr>
+            <w:r>
+              <w:rPr>
+                <w:rFonts w:ascii="Helvetica" w:hAnsi="Helvetica" w:cs="Helvetica"/>
+                <w:sz w:val="20"/>
+                <w:szCs w:val="20"/>
+              </w:rPr>
+              <w:t>Low</w:t>
+            </w:r>
+          </w:p>
+        </w:tc>
+      </w:tr>
+      <w:tr>
+        <w:trPr>
+          <w:trHeight w:val="465"/>
+          <w:jc w:val="center"/>
+        </w:trPr>
+        <w:tc>
+          <w:tcPr>
+            <w:tcW w:w="0" w:type="auto"/>
+          </w:tcPr>
+          <w:p>
+            <w:pPr>
+              <w:rPr>
+                <w:rFonts w:ascii="Helvetica" w:hAnsi="Helvetica" w:cs="Helvetica"/>
+                <w:sz w:val="20"/>
+                <w:szCs w:val="20"/>
+              </w:rPr>
+            </w:pPr>
+            <w:r>
+              <w:rPr>
+                <w:rFonts w:ascii="Helvetica" w:hAnsi="Helvetica" w:cs="Helvetica"/>
+                <w:sz w:val="20"/>
+                <w:szCs w:val="20"/>
+              </w:rPr>
+              <w:t>VF-7</w:t>
             </w:r>
           </w:p>
         </w:tc>

</xml_diff>